<commit_message>
#1 Add update DOCs
</commit_message>
<xml_diff>
--- a/docs/Instructions/MySQL_Interactive_Firmware_Development_Documentation.docx
+++ b/docs/Instructions/MySQL_Interactive_Firmware_Development_Documentation.docx
@@ -59,7 +59,7 @@
           <w:sz w:val="26"/>
           <w:shd w:fill="auto" w:val="clear"/>
         </w:rPr>
-        <w:t xml:space="preserve">Documentation</w:t>
+        <w:t xml:space="preserve">Documentation:</w:t>
       </w:r>
     </w:p>
     <w:p>
@@ -70,6 +70,1689 @@
         <w:ind w:right="0" w:left="0" w:firstLine="0"/>
         <w:jc w:val="left"/>
         <w:rPr>
+          <w:rFonts w:ascii="Cambria" w:hAnsi="Cambria" w:cs="Cambria" w:eastAsia="Cambria"/>
+          <w:b/>
+          <w:color w:val="4F81BD"/>
+          <w:spacing w:val="0"/>
+          <w:position w:val="0"/>
+          <w:sz w:val="26"/>
+          <w:shd w:fill="auto" w:val="clear"/>
+        </w:rPr>
+      </w:pPr>
+      <w:r>
+        <w:rPr>
+          <w:rFonts w:ascii="Cambria" w:hAnsi="Cambria" w:cs="Cambria" w:eastAsia="Cambria"/>
+          <w:b/>
+          <w:color w:val="4F81BD"/>
+          <w:spacing w:val="0"/>
+          <w:position w:val="0"/>
+          <w:sz w:val="28"/>
+          <w:shd w:fill="auto" w:val="clear"/>
+        </w:rPr>
+        <w:t xml:space="preserve">1- Setup ESP32 on ArduinoIDE:</w:t>
+      </w:r>
+    </w:p>
+    <w:p>
+      <w:pPr>
+        <w:keepNext w:val="true"/>
+        <w:keepLines w:val="true"/>
+        <w:spacing w:before="200" w:after="0" w:line="240"/>
+        <w:ind w:right="0" w:left="0" w:firstLine="0"/>
+        <w:jc w:val="left"/>
+        <w:rPr>
+          <w:rFonts w:ascii="Cambria" w:hAnsi="Cambria" w:cs="Cambria" w:eastAsia="Cambria"/>
+          <w:b/>
+          <w:color w:val="4F81BD"/>
+          <w:spacing w:val="0"/>
+          <w:position w:val="0"/>
+          <w:sz w:val="20"/>
+          <w:shd w:fill="auto" w:val="clear"/>
+        </w:rPr>
+      </w:pPr>
+      <w:r>
+        <w:rPr>
+          <w:rFonts w:ascii="Cambria" w:hAnsi="Cambria" w:cs="Cambria" w:eastAsia="Cambria"/>
+          <w:b/>
+          <w:color w:val="4F81BD"/>
+          <w:spacing w:val="0"/>
+          <w:position w:val="0"/>
+          <w:sz w:val="24"/>
+          <w:shd w:fill="auto" w:val="clear"/>
+        </w:rPr>
+        <w:t xml:space="preserve">Step 1: Install the ESP32 Board Manager URL</w:t>
+      </w:r>
+    </w:p>
+    <w:p>
+      <w:pPr>
+        <w:keepNext w:val="true"/>
+        <w:keepLines w:val="true"/>
+        <w:numPr>
+          <w:ilvl w:val="0"/>
+          <w:numId w:val="4"/>
+        </w:numPr>
+        <w:spacing w:before="200" w:after="0" w:line="240"/>
+        <w:ind w:right="0" w:left="720" w:hanging="360"/>
+        <w:jc w:val="left"/>
+        <w:rPr>
+          <w:rFonts w:ascii="Cambria" w:hAnsi="Cambria" w:cs="Cambria" w:eastAsia="Cambria"/>
+          <w:color w:val="auto"/>
+          <w:spacing w:val="0"/>
+          <w:position w:val="0"/>
+          <w:sz w:val="22"/>
+          <w:shd w:fill="auto" w:val="clear"/>
+        </w:rPr>
+      </w:pPr>
+      <w:r>
+        <w:rPr>
+          <w:rFonts w:ascii="Cambria" w:hAnsi="Cambria" w:cs="Cambria" w:eastAsia="Cambria"/>
+          <w:color w:val="auto"/>
+          <w:spacing w:val="0"/>
+          <w:position w:val="0"/>
+          <w:sz w:val="22"/>
+          <w:shd w:fill="auto" w:val="clear"/>
+        </w:rPr>
+        <w:t xml:space="preserve">Open Arduino IDE</w:t>
+      </w:r>
+    </w:p>
+    <w:p>
+      <w:pPr>
+        <w:keepNext w:val="true"/>
+        <w:keepLines w:val="true"/>
+        <w:numPr>
+          <w:ilvl w:val="0"/>
+          <w:numId w:val="4"/>
+        </w:numPr>
+        <w:spacing w:before="200" w:after="0" w:line="240"/>
+        <w:ind w:right="0" w:left="720" w:hanging="360"/>
+        <w:jc w:val="left"/>
+        <w:rPr>
+          <w:rFonts w:ascii="Cambria" w:hAnsi="Cambria" w:cs="Cambria" w:eastAsia="Cambria"/>
+          <w:color w:val="auto"/>
+          <w:spacing w:val="0"/>
+          <w:position w:val="0"/>
+          <w:sz w:val="22"/>
+          <w:shd w:fill="auto" w:val="clear"/>
+        </w:rPr>
+      </w:pPr>
+      <w:r>
+        <w:rPr>
+          <w:rFonts w:ascii="Cambria" w:hAnsi="Cambria" w:cs="Cambria" w:eastAsia="Cambria"/>
+          <w:color w:val="auto"/>
+          <w:spacing w:val="0"/>
+          <w:position w:val="0"/>
+          <w:sz w:val="22"/>
+          <w:shd w:fill="auto" w:val="clear"/>
+        </w:rPr>
+        <w:t xml:space="preserve">Go to File </w:t>
+      </w:r>
+      <w:r>
+        <w:rPr>
+          <w:rFonts w:ascii="Cambria Math" w:hAnsi="Cambria Math" w:cs="Cambria Math" w:eastAsia="Cambria Math"/>
+          <w:color w:val="auto"/>
+          <w:spacing w:val="0"/>
+          <w:position w:val="0"/>
+          <w:sz w:val="22"/>
+          <w:shd w:fill="auto" w:val="clear"/>
+        </w:rPr>
+        <w:t xml:space="preserve">→</w:t>
+      </w:r>
+      <w:r>
+        <w:rPr>
+          <w:rFonts w:ascii="Cambria" w:hAnsi="Cambria" w:cs="Cambria" w:eastAsia="Cambria"/>
+          <w:color w:val="auto"/>
+          <w:spacing w:val="0"/>
+          <w:position w:val="0"/>
+          <w:sz w:val="22"/>
+          <w:shd w:fill="auto" w:val="clear"/>
+        </w:rPr>
+        <w:t xml:space="preserve"> Preferences (on Windows/Linux)</w:t>
+      </w:r>
+    </w:p>
+    <w:p>
+      <w:pPr>
+        <w:keepNext w:val="true"/>
+        <w:keepLines w:val="true"/>
+        <w:numPr>
+          <w:ilvl w:val="0"/>
+          <w:numId w:val="4"/>
+        </w:numPr>
+        <w:spacing w:before="200" w:after="0" w:line="240"/>
+        <w:ind w:right="0" w:left="720" w:hanging="360"/>
+        <w:jc w:val="left"/>
+        <w:rPr>
+          <w:rFonts w:ascii="Cambria" w:hAnsi="Cambria" w:cs="Cambria" w:eastAsia="Cambria"/>
+          <w:color w:val="auto"/>
+          <w:spacing w:val="0"/>
+          <w:position w:val="0"/>
+          <w:sz w:val="22"/>
+          <w:shd w:fill="auto" w:val="clear"/>
+        </w:rPr>
+      </w:pPr>
+      <w:r>
+        <w:rPr>
+          <w:rFonts w:ascii="Cambria" w:hAnsi="Cambria" w:cs="Cambria" w:eastAsia="Cambria"/>
+          <w:color w:val="auto"/>
+          <w:spacing w:val="0"/>
+          <w:position w:val="0"/>
+          <w:sz w:val="22"/>
+          <w:shd w:fill="auto" w:val="clear"/>
+        </w:rPr>
+        <w:t xml:space="preserve">In</w:t>
+      </w:r>
+      <w:r>
+        <w:rPr>
+          <w:rFonts w:ascii="Cambria Math" w:hAnsi="Cambria Math" w:cs="Cambria Math" w:eastAsia="Cambria Math"/>
+          <w:color w:val="auto"/>
+          <w:spacing w:val="0"/>
+          <w:position w:val="0"/>
+          <w:sz w:val="22"/>
+          <w:shd w:fill="auto" w:val="clear"/>
+        </w:rPr>
+        <w:t xml:space="preserve"> </w:t>
+      </w:r>
+      <w:r>
+        <w:rPr>
+          <w:rFonts w:ascii="Cambria" w:hAnsi="Cambria" w:cs="Cambria" w:eastAsia="Cambria"/>
+          <w:color w:val="auto"/>
+          <w:spacing w:val="0"/>
+          <w:position w:val="0"/>
+          <w:sz w:val="22"/>
+          <w:shd w:fill="auto" w:val="clear"/>
+        </w:rPr>
+        <w:t xml:space="preserve">the</w:t>
+      </w:r>
+      <w:r>
+        <w:rPr>
+          <w:rFonts w:ascii="Cambria Math" w:hAnsi="Cambria Math" w:cs="Cambria Math" w:eastAsia="Cambria Math"/>
+          <w:color w:val="auto"/>
+          <w:spacing w:val="0"/>
+          <w:position w:val="0"/>
+          <w:sz w:val="22"/>
+          <w:shd w:fill="auto" w:val="clear"/>
+        </w:rPr>
+        <w:t xml:space="preserve"> </w:t>
+      </w:r>
+      <w:r>
+        <w:rPr>
+          <w:rFonts w:ascii="Cambria" w:hAnsi="Cambria" w:cs="Cambria" w:eastAsia="Cambria"/>
+          <w:color w:val="auto"/>
+          <w:spacing w:val="0"/>
+          <w:position w:val="0"/>
+          <w:sz w:val="22"/>
+          <w:shd w:fill="auto" w:val="clear"/>
+        </w:rPr>
+        <w:t xml:space="preserve">Additional</w:t>
+      </w:r>
+      <w:r>
+        <w:rPr>
+          <w:rFonts w:ascii="Cambria Math" w:hAnsi="Cambria Math" w:cs="Cambria Math" w:eastAsia="Cambria Math"/>
+          <w:color w:val="auto"/>
+          <w:spacing w:val="0"/>
+          <w:position w:val="0"/>
+          <w:sz w:val="22"/>
+          <w:shd w:fill="auto" w:val="clear"/>
+        </w:rPr>
+        <w:t xml:space="preserve"> </w:t>
+      </w:r>
+      <w:r>
+        <w:rPr>
+          <w:rFonts w:ascii="Cambria" w:hAnsi="Cambria" w:cs="Cambria" w:eastAsia="Cambria"/>
+          <w:color w:val="auto"/>
+          <w:spacing w:val="0"/>
+          <w:position w:val="0"/>
+          <w:sz w:val="22"/>
+          <w:shd w:fill="auto" w:val="clear"/>
+        </w:rPr>
+        <w:t xml:space="preserve">Board</w:t>
+      </w:r>
+      <w:r>
+        <w:rPr>
+          <w:rFonts w:ascii="Cambria Math" w:hAnsi="Cambria Math" w:cs="Cambria Math" w:eastAsia="Cambria Math"/>
+          <w:color w:val="auto"/>
+          <w:spacing w:val="0"/>
+          <w:position w:val="0"/>
+          <w:sz w:val="22"/>
+          <w:shd w:fill="auto" w:val="clear"/>
+        </w:rPr>
+        <w:t xml:space="preserve"> </w:t>
+      </w:r>
+      <w:r>
+        <w:rPr>
+          <w:rFonts w:ascii="Cambria" w:hAnsi="Cambria" w:cs="Cambria" w:eastAsia="Cambria"/>
+          <w:color w:val="auto"/>
+          <w:spacing w:val="0"/>
+          <w:position w:val="0"/>
+          <w:sz w:val="22"/>
+          <w:shd w:fill="auto" w:val="clear"/>
+        </w:rPr>
+        <w:t xml:space="preserve">Manager</w:t>
+      </w:r>
+      <w:r>
+        <w:rPr>
+          <w:rFonts w:ascii="Cambria Math" w:hAnsi="Cambria Math" w:cs="Cambria Math" w:eastAsia="Cambria Math"/>
+          <w:color w:val="auto"/>
+          <w:spacing w:val="0"/>
+          <w:position w:val="0"/>
+          <w:sz w:val="22"/>
+          <w:shd w:fill="auto" w:val="clear"/>
+        </w:rPr>
+        <w:t xml:space="preserve"> </w:t>
+      </w:r>
+      <w:r>
+        <w:rPr>
+          <w:rFonts w:ascii="Cambria" w:hAnsi="Cambria" w:cs="Cambria" w:eastAsia="Cambria"/>
+          <w:color w:val="auto"/>
+          <w:spacing w:val="0"/>
+          <w:position w:val="0"/>
+          <w:sz w:val="22"/>
+          <w:shd w:fill="auto" w:val="clear"/>
+        </w:rPr>
+        <w:t xml:space="preserve">URLs</w:t>
+      </w:r>
+      <w:r>
+        <w:rPr>
+          <w:rFonts w:ascii="Cambria Math" w:hAnsi="Cambria Math" w:cs="Cambria Math" w:eastAsia="Cambria Math"/>
+          <w:color w:val="auto"/>
+          <w:spacing w:val="0"/>
+          <w:position w:val="0"/>
+          <w:sz w:val="22"/>
+          <w:shd w:fill="auto" w:val="clear"/>
+        </w:rPr>
+        <w:t xml:space="preserve"> </w:t>
+      </w:r>
+      <w:r>
+        <w:rPr>
+          <w:rFonts w:ascii="Cambria" w:hAnsi="Cambria" w:cs="Cambria" w:eastAsia="Cambria"/>
+          <w:color w:val="auto"/>
+          <w:spacing w:val="0"/>
+          <w:position w:val="0"/>
+          <w:sz w:val="22"/>
+          <w:shd w:fill="auto" w:val="clear"/>
+        </w:rPr>
+        <w:t xml:space="preserve">field</w:t>
+      </w:r>
+      <w:r>
+        <w:rPr>
+          <w:rFonts w:ascii="Cambria Math" w:hAnsi="Cambria Math" w:cs="Cambria Math" w:eastAsia="Cambria Math"/>
+          <w:color w:val="auto"/>
+          <w:spacing w:val="0"/>
+          <w:position w:val="0"/>
+          <w:sz w:val="22"/>
+          <w:shd w:fill="auto" w:val="clear"/>
+        </w:rPr>
+        <w:t xml:space="preserve">, </w:t>
+      </w:r>
+      <w:r>
+        <w:rPr>
+          <w:rFonts w:ascii="Cambria" w:hAnsi="Cambria" w:cs="Cambria" w:eastAsia="Cambria"/>
+          <w:color w:val="auto"/>
+          <w:spacing w:val="0"/>
+          <w:position w:val="0"/>
+          <w:sz w:val="22"/>
+          <w:shd w:fill="auto" w:val="clear"/>
+        </w:rPr>
+        <w:t xml:space="preserve">paste</w:t>
+      </w:r>
+      <w:r>
+        <w:rPr>
+          <w:rFonts w:ascii="Cambria Math" w:hAnsi="Cambria Math" w:cs="Cambria Math" w:eastAsia="Cambria Math"/>
+          <w:color w:val="auto"/>
+          <w:spacing w:val="0"/>
+          <w:position w:val="0"/>
+          <w:sz w:val="22"/>
+          <w:shd w:fill="auto" w:val="clear"/>
+        </w:rPr>
+        <w:t xml:space="preserve"> </w:t>
+      </w:r>
+      <w:r>
+        <w:rPr>
+          <w:rFonts w:ascii="Cambria" w:hAnsi="Cambria" w:cs="Cambria" w:eastAsia="Cambria"/>
+          <w:color w:val="auto"/>
+          <w:spacing w:val="0"/>
+          <w:position w:val="0"/>
+          <w:sz w:val="22"/>
+          <w:shd w:fill="auto" w:val="clear"/>
+        </w:rPr>
+        <w:t xml:space="preserve">the</w:t>
+      </w:r>
+      <w:r>
+        <w:rPr>
+          <w:rFonts w:ascii="Cambria Math" w:hAnsi="Cambria Math" w:cs="Cambria Math" w:eastAsia="Cambria Math"/>
+          <w:color w:val="auto"/>
+          <w:spacing w:val="0"/>
+          <w:position w:val="0"/>
+          <w:sz w:val="22"/>
+          <w:shd w:fill="auto" w:val="clear"/>
+        </w:rPr>
+        <w:t xml:space="preserve"> </w:t>
+      </w:r>
+      <w:r>
+        <w:rPr>
+          <w:rFonts w:ascii="Cambria" w:hAnsi="Cambria" w:cs="Cambria" w:eastAsia="Cambria"/>
+          <w:color w:val="auto"/>
+          <w:spacing w:val="0"/>
+          <w:position w:val="0"/>
+          <w:sz w:val="22"/>
+          <w:shd w:fill="auto" w:val="clear"/>
+        </w:rPr>
+        <w:t xml:space="preserve">following</w:t>
+      </w:r>
+      <w:r>
+        <w:rPr>
+          <w:rFonts w:ascii="Cambria Math" w:hAnsi="Cambria Math" w:cs="Cambria Math" w:eastAsia="Cambria Math"/>
+          <w:color w:val="auto"/>
+          <w:spacing w:val="0"/>
+          <w:position w:val="0"/>
+          <w:sz w:val="22"/>
+          <w:shd w:fill="auto" w:val="clear"/>
+        </w:rPr>
+        <w:t xml:space="preserve"> </w:t>
+      </w:r>
+      <w:r>
+        <w:rPr>
+          <w:rFonts w:ascii="Cambria" w:hAnsi="Cambria" w:cs="Cambria" w:eastAsia="Cambria"/>
+          <w:color w:val="auto"/>
+          <w:spacing w:val="0"/>
+          <w:position w:val="0"/>
+          <w:sz w:val="22"/>
+          <w:shd w:fill="auto" w:val="clear"/>
+        </w:rPr>
+        <w:t xml:space="preserve">URL</w:t>
+      </w:r>
+      <w:r>
+        <w:rPr>
+          <w:rFonts w:ascii="Cambria Math" w:hAnsi="Cambria Math" w:cs="Cambria Math" w:eastAsia="Cambria Math"/>
+          <w:color w:val="auto"/>
+          <w:spacing w:val="0"/>
+          <w:position w:val="0"/>
+          <w:sz w:val="22"/>
+          <w:shd w:fill="auto" w:val="clear"/>
+        </w:rPr>
+        <w:t xml:space="preserve">:</w:t>
+      </w:r>
+    </w:p>
+    <w:p>
+      <w:pPr>
+        <w:keepNext w:val="true"/>
+        <w:keepLines w:val="true"/>
+        <w:spacing w:before="200" w:after="0" w:line="240"/>
+        <w:ind w:right="0" w:left="0" w:firstLine="0"/>
+        <w:jc w:val="both"/>
+        <w:rPr>
+          <w:rFonts w:ascii="Cambria Math" w:hAnsi="Cambria Math" w:cs="Cambria Math" w:eastAsia="Cambria Math"/>
+          <w:color w:val="auto"/>
+          <w:spacing w:val="0"/>
+          <w:position w:val="0"/>
+          <w:sz w:val="20"/>
+          <w:shd w:fill="auto" w:val="clear"/>
+        </w:rPr>
+      </w:pPr>
+      <w:hyperlink xmlns:r="http://schemas.openxmlformats.org/officeDocument/2006/relationships" r:id="docRId0">
+        <w:r>
+          <w:rPr>
+            <w:rFonts w:ascii="Cambria Math" w:hAnsi="Cambria Math" w:cs="Cambria Math" w:eastAsia="Cambria Math"/>
+            <w:color w:val="0000FF"/>
+            <w:spacing w:val="0"/>
+            <w:position w:val="0"/>
+            <w:sz w:val="20"/>
+            <w:u w:val="single"/>
+            <w:shd w:fill="auto" w:val="clear"/>
+          </w:rPr>
+          <w:t xml:space="preserve">http://arduino.esp8266.com/stable/package_esp8266com_index.json,https://dl.espressif.com/dl/package_esp32_index.json,https://raw.githubusercontent.com/espressif/arduino-esp32/gh-pages/package_esp32_index.json</w:t>
+        </w:r>
+      </w:hyperlink>
+    </w:p>
+    <w:p>
+      <w:pPr>
+        <w:keepNext w:val="true"/>
+        <w:keepLines w:val="true"/>
+        <w:spacing w:before="200" w:after="0" w:line="240"/>
+        <w:ind w:right="0" w:left="0" w:firstLine="0"/>
+        <w:jc w:val="left"/>
+        <w:rPr>
+          <w:rFonts w:ascii="Cambria" w:hAnsi="Cambria" w:cs="Cambria" w:eastAsia="Cambria"/>
+          <w:b/>
+          <w:color w:val="4F81BD"/>
+          <w:spacing w:val="0"/>
+          <w:position w:val="0"/>
+          <w:sz w:val="20"/>
+          <w:shd w:fill="auto" w:val="clear"/>
+        </w:rPr>
+      </w:pPr>
+      <w:r>
+        <w:rPr>
+          <w:rFonts w:ascii="Cambria" w:hAnsi="Cambria" w:cs="Cambria" w:eastAsia="Cambria"/>
+          <w:b/>
+          <w:color w:val="4F81BD"/>
+          <w:spacing w:val="0"/>
+          <w:position w:val="0"/>
+          <w:sz w:val="24"/>
+          <w:shd w:fill="auto" w:val="clear"/>
+        </w:rPr>
+        <w:t xml:space="preserve">Step 2: Install the ESP32 Boards</w:t>
+      </w:r>
+    </w:p>
+    <w:p>
+      <w:pPr>
+        <w:keepNext w:val="true"/>
+        <w:keepLines w:val="true"/>
+        <w:numPr>
+          <w:ilvl w:val="0"/>
+          <w:numId w:val="7"/>
+        </w:numPr>
+        <w:spacing w:before="200" w:after="0" w:line="240"/>
+        <w:ind w:right="0" w:left="720" w:hanging="360"/>
+        <w:jc w:val="left"/>
+        <w:rPr>
+          <w:rFonts w:ascii="Cambria Math" w:hAnsi="Cambria Math" w:cs="Cambria Math" w:eastAsia="Cambria Math"/>
+          <w:color w:val="auto"/>
+          <w:spacing w:val="0"/>
+          <w:position w:val="0"/>
+          <w:sz w:val="22"/>
+          <w:shd w:fill="auto" w:val="clear"/>
+        </w:rPr>
+      </w:pPr>
+      <w:r>
+        <w:rPr>
+          <w:rFonts w:ascii="Cambria" w:hAnsi="Cambria" w:cs="Cambria" w:eastAsia="Cambria"/>
+          <w:color w:val="auto"/>
+          <w:spacing w:val="0"/>
+          <w:position w:val="0"/>
+          <w:sz w:val="22"/>
+          <w:shd w:fill="auto" w:val="clear"/>
+        </w:rPr>
+        <w:t xml:space="preserve">Go to Tools </w:t>
+      </w:r>
+      <w:r>
+        <w:rPr>
+          <w:rFonts w:ascii="Cambria Math" w:hAnsi="Cambria Math" w:cs="Cambria Math" w:eastAsia="Cambria Math"/>
+          <w:color w:val="auto"/>
+          <w:spacing w:val="0"/>
+          <w:position w:val="0"/>
+          <w:sz w:val="22"/>
+          <w:shd w:fill="auto" w:val="clear"/>
+        </w:rPr>
+        <w:t xml:space="preserve">→ Board → Boards Manager.</w:t>
+      </w:r>
+    </w:p>
+    <w:p>
+      <w:pPr>
+        <w:keepNext w:val="true"/>
+        <w:keepLines w:val="true"/>
+        <w:numPr>
+          <w:ilvl w:val="0"/>
+          <w:numId w:val="7"/>
+        </w:numPr>
+        <w:spacing w:before="200" w:after="0" w:line="240"/>
+        <w:ind w:right="0" w:left="720" w:hanging="360"/>
+        <w:jc w:val="left"/>
+        <w:rPr>
+          <w:rFonts w:ascii="Cambria Math" w:hAnsi="Cambria Math" w:cs="Cambria Math" w:eastAsia="Cambria Math"/>
+          <w:color w:val="auto"/>
+          <w:spacing w:val="0"/>
+          <w:position w:val="0"/>
+          <w:sz w:val="22"/>
+          <w:shd w:fill="auto" w:val="clear"/>
+        </w:rPr>
+      </w:pPr>
+      <w:r>
+        <w:rPr>
+          <w:rFonts w:ascii="Cambria Math" w:hAnsi="Cambria Math" w:cs="Cambria Math" w:eastAsia="Cambria Math"/>
+          <w:color w:val="auto"/>
+          <w:spacing w:val="0"/>
+          <w:position w:val="0"/>
+          <w:sz w:val="22"/>
+          <w:shd w:fill="auto" w:val="clear"/>
+        </w:rPr>
+        <w:t xml:space="preserve">In the search bar, type esp32.</w:t>
+      </w:r>
+    </w:p>
+    <w:p>
+      <w:pPr>
+        <w:keepNext w:val="true"/>
+        <w:keepLines w:val="true"/>
+        <w:numPr>
+          <w:ilvl w:val="0"/>
+          <w:numId w:val="7"/>
+        </w:numPr>
+        <w:spacing w:before="200" w:after="0" w:line="240"/>
+        <w:ind w:right="0" w:left="720" w:hanging="360"/>
+        <w:jc w:val="left"/>
+        <w:rPr>
+          <w:rFonts w:ascii="Cambria Math" w:hAnsi="Cambria Math" w:cs="Cambria Math" w:eastAsia="Cambria Math"/>
+          <w:color w:val="auto"/>
+          <w:spacing w:val="0"/>
+          <w:position w:val="0"/>
+          <w:sz w:val="22"/>
+          <w:shd w:fill="auto" w:val="clear"/>
+        </w:rPr>
+      </w:pPr>
+      <w:r>
+        <w:rPr>
+          <w:rFonts w:ascii="Cambria Math" w:hAnsi="Cambria Math" w:cs="Cambria Math" w:eastAsia="Cambria Math"/>
+          <w:color w:val="auto"/>
+          <w:spacing w:val="0"/>
+          <w:position w:val="0"/>
+          <w:sz w:val="22"/>
+          <w:shd w:fill="auto" w:val="clear"/>
+        </w:rPr>
+        <w:t xml:space="preserve">Find and select the esp32 by Espressif Systems package.</w:t>
+      </w:r>
+    </w:p>
+    <w:p>
+      <w:pPr>
+        <w:keepNext w:val="true"/>
+        <w:keepLines w:val="true"/>
+        <w:numPr>
+          <w:ilvl w:val="0"/>
+          <w:numId w:val="7"/>
+        </w:numPr>
+        <w:spacing w:before="200" w:after="0" w:line="240"/>
+        <w:ind w:right="0" w:left="720" w:hanging="360"/>
+        <w:jc w:val="left"/>
+        <w:rPr>
+          <w:rFonts w:ascii="Calibri" w:hAnsi="Calibri" w:cs="Calibri" w:eastAsia="Calibri"/>
+          <w:b/>
+          <w:color w:val="4F81BD"/>
+          <w:spacing w:val="0"/>
+          <w:position w:val="0"/>
+          <w:sz w:val="22"/>
+          <w:shd w:fill="auto" w:val="clear"/>
+        </w:rPr>
+      </w:pPr>
+      <w:r>
+        <w:rPr>
+          <w:rFonts w:ascii="Cambria Math" w:hAnsi="Cambria Math" w:cs="Cambria Math" w:eastAsia="Cambria Math"/>
+          <w:color w:val="auto"/>
+          <w:spacing w:val="0"/>
+          <w:position w:val="0"/>
+          <w:sz w:val="22"/>
+          <w:shd w:fill="auto" w:val="clear"/>
+        </w:rPr>
+        <w:t xml:space="preserve">Click Install and wait for the installation to complete</w:t>
+      </w:r>
+    </w:p>
+    <w:p>
+      <w:pPr>
+        <w:keepNext w:val="true"/>
+        <w:keepLines w:val="true"/>
+        <w:spacing w:before="200" w:after="0" w:line="240"/>
+        <w:ind w:right="0" w:left="0" w:firstLine="0"/>
+        <w:jc w:val="left"/>
+        <w:rPr>
+          <w:rFonts w:ascii="Cambria" w:hAnsi="Cambria" w:cs="Cambria" w:eastAsia="Cambria"/>
+          <w:b/>
+          <w:color w:val="4F81BD"/>
+          <w:spacing w:val="0"/>
+          <w:position w:val="0"/>
+          <w:sz w:val="20"/>
+          <w:shd w:fill="auto" w:val="clear"/>
+        </w:rPr>
+      </w:pPr>
+      <w:r>
+        <w:rPr>
+          <w:rFonts w:ascii="Cambria" w:hAnsi="Cambria" w:cs="Cambria" w:eastAsia="Cambria"/>
+          <w:b/>
+          <w:color w:val="4F81BD"/>
+          <w:spacing w:val="0"/>
+          <w:position w:val="0"/>
+          <w:sz w:val="24"/>
+          <w:shd w:fill="auto" w:val="clear"/>
+        </w:rPr>
+        <w:t xml:space="preserve">Step 3: Select the ESP32 Board</w:t>
+      </w:r>
+    </w:p>
+    <w:p>
+      <w:pPr>
+        <w:keepNext w:val="true"/>
+        <w:keepLines w:val="true"/>
+        <w:numPr>
+          <w:ilvl w:val="0"/>
+          <w:numId w:val="9"/>
+        </w:numPr>
+        <w:spacing w:before="200" w:after="0" w:line="240"/>
+        <w:ind w:right="0" w:left="720" w:hanging="360"/>
+        <w:jc w:val="left"/>
+        <w:rPr>
+          <w:rFonts w:ascii="Cambria" w:hAnsi="Cambria" w:cs="Cambria" w:eastAsia="Cambria"/>
+          <w:color w:val="auto"/>
+          <w:spacing w:val="0"/>
+          <w:position w:val="0"/>
+          <w:sz w:val="22"/>
+          <w:shd w:fill="auto" w:val="clear"/>
+        </w:rPr>
+      </w:pPr>
+      <w:r>
+        <w:rPr>
+          <w:rFonts w:ascii="Cambria" w:hAnsi="Cambria" w:cs="Cambria" w:eastAsia="Cambria"/>
+          <w:color w:val="auto"/>
+          <w:spacing w:val="0"/>
+          <w:position w:val="0"/>
+          <w:sz w:val="22"/>
+          <w:shd w:fill="auto" w:val="clear"/>
+        </w:rPr>
+        <w:t xml:space="preserve">Go to Tools </w:t>
+      </w:r>
+      <w:r>
+        <w:rPr>
+          <w:rFonts w:ascii="Cambria Math" w:hAnsi="Cambria Math" w:cs="Cambria Math" w:eastAsia="Cambria Math"/>
+          <w:color w:val="auto"/>
+          <w:spacing w:val="0"/>
+          <w:position w:val="0"/>
+          <w:sz w:val="22"/>
+          <w:shd w:fill="auto" w:val="clear"/>
+        </w:rPr>
+        <w:t xml:space="preserve">→</w:t>
+      </w:r>
+      <w:r>
+        <w:rPr>
+          <w:rFonts w:ascii="Cambria" w:hAnsi="Cambria" w:cs="Cambria" w:eastAsia="Cambria"/>
+          <w:color w:val="auto"/>
+          <w:spacing w:val="0"/>
+          <w:position w:val="0"/>
+          <w:sz w:val="22"/>
+          <w:shd w:fill="auto" w:val="clear"/>
+        </w:rPr>
+        <w:t xml:space="preserve"> Board.</w:t>
+      </w:r>
+    </w:p>
+    <w:p>
+      <w:pPr>
+        <w:keepNext w:val="true"/>
+        <w:keepLines w:val="true"/>
+        <w:numPr>
+          <w:ilvl w:val="0"/>
+          <w:numId w:val="9"/>
+        </w:numPr>
+        <w:spacing w:before="200" w:after="0" w:line="240"/>
+        <w:ind w:right="0" w:left="720" w:hanging="360"/>
+        <w:jc w:val="left"/>
+        <w:rPr>
+          <w:rFonts w:ascii="Cambria" w:hAnsi="Cambria" w:cs="Cambria" w:eastAsia="Cambria"/>
+          <w:color w:val="auto"/>
+          <w:spacing w:val="0"/>
+          <w:position w:val="0"/>
+          <w:sz w:val="22"/>
+          <w:shd w:fill="auto" w:val="clear"/>
+        </w:rPr>
+      </w:pPr>
+      <w:r>
+        <w:rPr>
+          <w:rFonts w:ascii="Cambria" w:hAnsi="Cambria" w:cs="Cambria" w:eastAsia="Cambria"/>
+          <w:color w:val="auto"/>
+          <w:spacing w:val="0"/>
+          <w:position w:val="0"/>
+          <w:sz w:val="22"/>
+          <w:shd w:fill="auto" w:val="clear"/>
+        </w:rPr>
+        <w:t xml:space="preserve">Scroll down and select the appropriate ESP32 board (e.g., ESP32 Dev Module).</w:t>
+      </w:r>
+    </w:p>
+    <w:p>
+      <w:pPr>
+        <w:keepNext w:val="true"/>
+        <w:keepLines w:val="true"/>
+        <w:spacing w:before="200" w:after="0" w:line="240"/>
+        <w:ind w:right="0" w:left="0" w:firstLine="0"/>
+        <w:jc w:val="left"/>
+        <w:rPr>
+          <w:rFonts w:ascii="Cambria" w:hAnsi="Cambria" w:cs="Cambria" w:eastAsia="Cambria"/>
+          <w:color w:val="auto"/>
+          <w:spacing w:val="0"/>
+          <w:position w:val="0"/>
+          <w:sz w:val="22"/>
+          <w:shd w:fill="auto" w:val="clear"/>
+        </w:rPr>
+      </w:pPr>
+      <w:r>
+        <w:rPr>
+          <w:rFonts w:ascii="Cambria" w:hAnsi="Cambria" w:cs="Cambria" w:eastAsia="Cambria"/>
+          <w:b/>
+          <w:color w:val="4F81BD"/>
+          <w:spacing w:val="0"/>
+          <w:position w:val="0"/>
+          <w:sz w:val="24"/>
+          <w:shd w:fill="auto" w:val="clear"/>
+        </w:rPr>
+        <w:t xml:space="preserve">Step 4: Select the COM port.</w:t>
+      </w:r>
+    </w:p>
+    <w:p>
+      <w:pPr>
+        <w:keepNext w:val="true"/>
+        <w:keepLines w:val="true"/>
+        <w:numPr>
+          <w:ilvl w:val="0"/>
+          <w:numId w:val="11"/>
+        </w:numPr>
+        <w:spacing w:before="200" w:after="0" w:line="240"/>
+        <w:ind w:right="0" w:left="720" w:hanging="360"/>
+        <w:jc w:val="left"/>
+        <w:rPr>
+          <w:rFonts w:ascii="Cambria Math" w:hAnsi="Cambria Math" w:cs="Cambria Math" w:eastAsia="Cambria Math"/>
+          <w:color w:val="auto"/>
+          <w:spacing w:val="0"/>
+          <w:position w:val="0"/>
+          <w:sz w:val="22"/>
+          <w:shd w:fill="auto" w:val="clear"/>
+        </w:rPr>
+      </w:pPr>
+      <w:r>
+        <w:rPr>
+          <w:rFonts w:ascii="Cambria" w:hAnsi="Cambria" w:cs="Cambria" w:eastAsia="Cambria"/>
+          <w:color w:val="auto"/>
+          <w:spacing w:val="0"/>
+          <w:position w:val="0"/>
+          <w:sz w:val="22"/>
+          <w:shd w:fill="auto" w:val="clear"/>
+        </w:rPr>
+        <w:t xml:space="preserve">Go</w:t>
+      </w:r>
+      <w:r>
+        <w:rPr>
+          <w:rFonts w:ascii="Cambria Math" w:hAnsi="Cambria Math" w:cs="Cambria Math" w:eastAsia="Cambria Math"/>
+          <w:color w:val="auto"/>
+          <w:spacing w:val="0"/>
+          <w:position w:val="0"/>
+          <w:sz w:val="22"/>
+          <w:shd w:fill="auto" w:val="clear"/>
+        </w:rPr>
+        <w:t xml:space="preserve"> </w:t>
+      </w:r>
+      <w:r>
+        <w:rPr>
+          <w:rFonts w:ascii="Cambria" w:hAnsi="Cambria" w:cs="Cambria" w:eastAsia="Cambria"/>
+          <w:color w:val="auto"/>
+          <w:spacing w:val="0"/>
+          <w:position w:val="0"/>
+          <w:sz w:val="22"/>
+          <w:shd w:fill="auto" w:val="clear"/>
+        </w:rPr>
+        <w:t xml:space="preserve">to</w:t>
+      </w:r>
+      <w:r>
+        <w:rPr>
+          <w:rFonts w:ascii="Cambria Math" w:hAnsi="Cambria Math" w:cs="Cambria Math" w:eastAsia="Cambria Math"/>
+          <w:color w:val="auto"/>
+          <w:spacing w:val="0"/>
+          <w:position w:val="0"/>
+          <w:sz w:val="22"/>
+          <w:shd w:fill="auto" w:val="clear"/>
+        </w:rPr>
+        <w:t xml:space="preserve"> </w:t>
+      </w:r>
+      <w:r>
+        <w:rPr>
+          <w:rFonts w:ascii="Cambria" w:hAnsi="Cambria" w:cs="Cambria" w:eastAsia="Cambria"/>
+          <w:color w:val="auto"/>
+          <w:spacing w:val="0"/>
+          <w:position w:val="0"/>
+          <w:sz w:val="22"/>
+          <w:shd w:fill="auto" w:val="clear"/>
+        </w:rPr>
+        <w:t xml:space="preserve">Tools</w:t>
+      </w:r>
+      <w:r>
+        <w:rPr>
+          <w:rFonts w:ascii="Cambria Math" w:hAnsi="Cambria Math" w:cs="Cambria Math" w:eastAsia="Cambria Math"/>
+          <w:color w:val="auto"/>
+          <w:spacing w:val="0"/>
+          <w:position w:val="0"/>
+          <w:sz w:val="22"/>
+          <w:shd w:fill="auto" w:val="clear"/>
+        </w:rPr>
+        <w:t xml:space="preserve"> </w:t>
+      </w:r>
+      <w:r>
+        <w:rPr>
+          <w:rFonts w:ascii="Cambria Math" w:hAnsi="Cambria Math" w:cs="Cambria Math" w:eastAsia="Cambria Math"/>
+          <w:color w:val="auto"/>
+          <w:spacing w:val="0"/>
+          <w:position w:val="0"/>
+          <w:sz w:val="22"/>
+          <w:shd w:fill="auto" w:val="clear"/>
+        </w:rPr>
+        <w:t xml:space="preserve">→ Port.</w:t>
+      </w:r>
+    </w:p>
+    <w:p>
+      <w:pPr>
+        <w:keepNext w:val="true"/>
+        <w:keepLines w:val="true"/>
+        <w:numPr>
+          <w:ilvl w:val="0"/>
+          <w:numId w:val="11"/>
+        </w:numPr>
+        <w:spacing w:before="200" w:after="0" w:line="240"/>
+        <w:ind w:right="0" w:left="720" w:hanging="360"/>
+        <w:jc w:val="left"/>
+        <w:rPr>
+          <w:rFonts w:ascii="Cambria" w:hAnsi="Cambria" w:cs="Cambria" w:eastAsia="Cambria"/>
+          <w:color w:val="auto"/>
+          <w:spacing w:val="0"/>
+          <w:position w:val="0"/>
+          <w:sz w:val="22"/>
+          <w:shd w:fill="auto" w:val="clear"/>
+        </w:rPr>
+      </w:pPr>
+      <w:r>
+        <w:rPr>
+          <w:rFonts w:ascii="Cambria Math" w:hAnsi="Cambria Math" w:cs="Cambria Math" w:eastAsia="Cambria Math"/>
+          <w:color w:val="auto"/>
+          <w:spacing w:val="0"/>
+          <w:position w:val="0"/>
+          <w:sz w:val="22"/>
+          <w:shd w:fill="auto" w:val="clear"/>
+        </w:rPr>
+        <w:t xml:space="preserve">Select the port corresponding to your ESP32 board (e.g., COM3</w:t>
+      </w:r>
+    </w:p>
+    <w:p>
+      <w:pPr>
+        <w:keepNext w:val="true"/>
+        <w:keepLines w:val="true"/>
+        <w:spacing w:before="200" w:after="0" w:line="240"/>
+        <w:ind w:right="0" w:left="0" w:firstLine="0"/>
+        <w:jc w:val="left"/>
+        <w:rPr>
+          <w:rFonts w:ascii="Cambria" w:hAnsi="Cambria" w:cs="Cambria" w:eastAsia="Cambria"/>
+          <w:color w:val="auto"/>
+          <w:spacing w:val="0"/>
+          <w:position w:val="0"/>
+          <w:sz w:val="22"/>
+          <w:shd w:fill="auto" w:val="clear"/>
+        </w:rPr>
+      </w:pPr>
+    </w:p>
+    <w:p>
+      <w:pPr>
+        <w:keepNext w:val="true"/>
+        <w:keepLines w:val="true"/>
+        <w:spacing w:before="200" w:after="0" w:line="240"/>
+        <w:ind w:right="0" w:left="0" w:firstLine="0"/>
+        <w:jc w:val="left"/>
+        <w:rPr>
+          <w:rFonts w:ascii="Calibri" w:hAnsi="Calibri" w:cs="Calibri" w:eastAsia="Calibri"/>
+          <w:b/>
+          <w:color w:val="4F81BD"/>
+          <w:spacing w:val="0"/>
+          <w:position w:val="0"/>
+          <w:sz w:val="22"/>
+          <w:shd w:fill="auto" w:val="clear"/>
+        </w:rPr>
+      </w:pPr>
+      <w:r>
+        <w:rPr>
+          <w:rFonts w:ascii="Calibri" w:hAnsi="Calibri" w:cs="Calibri" w:eastAsia="Calibri"/>
+          <w:b/>
+          <w:color w:val="4F81BD"/>
+          <w:spacing w:val="0"/>
+          <w:position w:val="0"/>
+          <w:sz w:val="24"/>
+          <w:shd w:fill="auto" w:val="clear"/>
+        </w:rPr>
+        <w:t xml:space="preserve">NOTE: Arduino Libraries:</w:t>
+      </w:r>
+    </w:p>
+    <w:p>
+      <w:pPr>
+        <w:keepNext w:val="true"/>
+        <w:keepLines w:val="true"/>
+        <w:spacing w:before="200" w:after="0" w:line="240"/>
+        <w:ind w:right="0" w:left="0" w:firstLine="0"/>
+        <w:jc w:val="left"/>
+        <w:rPr>
+          <w:rFonts w:ascii="Cambria" w:hAnsi="Cambria" w:cs="Cambria" w:eastAsia="Cambria"/>
+          <w:color w:val="auto"/>
+          <w:spacing w:val="0"/>
+          <w:position w:val="0"/>
+          <w:sz w:val="22"/>
+          <w:shd w:fill="auto" w:val="clear"/>
+        </w:rPr>
+      </w:pPr>
+      <w:r>
+        <w:rPr>
+          <w:rFonts w:ascii="Cambria" w:hAnsi="Cambria" w:cs="Cambria" w:eastAsia="Cambria"/>
+          <w:color w:val="auto"/>
+          <w:spacing w:val="0"/>
+          <w:position w:val="0"/>
+          <w:sz w:val="22"/>
+          <w:shd w:fill="auto" w:val="clear"/>
+        </w:rPr>
+        <w:t xml:space="preserve">Install the following libraries in arduino: </w:t>
+      </w:r>
+    </w:p>
+    <w:p>
+      <w:pPr>
+        <w:keepNext w:val="true"/>
+        <w:keepLines w:val="true"/>
+        <w:spacing w:before="200" w:after="0" w:line="240"/>
+        <w:ind w:right="0" w:left="0" w:firstLine="0"/>
+        <w:jc w:val="left"/>
+        <w:rPr>
+          <w:rFonts w:ascii="Calibri" w:hAnsi="Calibri" w:cs="Calibri" w:eastAsia="Calibri"/>
+          <w:b/>
+          <w:color w:val="4F81BD"/>
+          <w:spacing w:val="0"/>
+          <w:position w:val="0"/>
+          <w:sz w:val="22"/>
+          <w:shd w:fill="auto" w:val="clear"/>
+        </w:rPr>
+      </w:pPr>
+      <w:r>
+        <w:rPr>
+          <w:rFonts w:ascii="Cambria" w:hAnsi="Cambria" w:cs="Cambria" w:eastAsia="Cambria"/>
+          <w:color w:val="auto"/>
+          <w:spacing w:val="0"/>
+          <w:position w:val="0"/>
+          <w:sz w:val="22"/>
+          <w:shd w:fill="auto" w:val="clear"/>
+        </w:rPr>
+        <w:t xml:space="preserve">Go to Tools </w:t>
+      </w:r>
+      <w:r>
+        <w:rPr>
+          <w:rFonts w:ascii="Cambria Math" w:hAnsi="Cambria Math" w:cs="Cambria Math" w:eastAsia="Cambria Math"/>
+          <w:color w:val="auto"/>
+          <w:spacing w:val="0"/>
+          <w:position w:val="0"/>
+          <w:sz w:val="22"/>
+          <w:shd w:fill="auto" w:val="clear"/>
+        </w:rPr>
+        <w:t xml:space="preserve">→ Manage libraries → (Search the library).</w:t>
+      </w:r>
+    </w:p>
+    <w:p>
+      <w:pPr>
+        <w:keepNext w:val="true"/>
+        <w:keepLines w:val="true"/>
+        <w:numPr>
+          <w:ilvl w:val="0"/>
+          <w:numId w:val="13"/>
+        </w:numPr>
+        <w:spacing w:before="200" w:after="0" w:line="240"/>
+        <w:ind w:right="0" w:left="720" w:hanging="360"/>
+        <w:jc w:val="left"/>
+        <w:rPr>
+          <w:rFonts w:ascii="Cambria" w:hAnsi="Cambria" w:cs="Cambria" w:eastAsia="Cambria"/>
+          <w:color w:val="auto"/>
+          <w:spacing w:val="0"/>
+          <w:position w:val="0"/>
+          <w:sz w:val="22"/>
+          <w:shd w:fill="auto" w:val="clear"/>
+        </w:rPr>
+      </w:pPr>
+      <w:r>
+        <w:rPr>
+          <w:rFonts w:ascii="Cambria" w:hAnsi="Cambria" w:cs="Cambria" w:eastAsia="Cambria"/>
+          <w:color w:val="auto"/>
+          <w:spacing w:val="0"/>
+          <w:position w:val="0"/>
+          <w:sz w:val="22"/>
+          <w:shd w:fill="auto" w:val="clear"/>
+        </w:rPr>
+        <w:t xml:space="preserve">ArduinoJSON(v7.2.1)</w:t>
+      </w:r>
+    </w:p>
+    <w:p>
+      <w:pPr>
+        <w:keepNext w:val="true"/>
+        <w:keepLines w:val="true"/>
+        <w:numPr>
+          <w:ilvl w:val="0"/>
+          <w:numId w:val="13"/>
+        </w:numPr>
+        <w:spacing w:before="200" w:after="0" w:line="240"/>
+        <w:ind w:right="0" w:left="720" w:hanging="360"/>
+        <w:jc w:val="left"/>
+        <w:rPr>
+          <w:rFonts w:ascii="Cambria" w:hAnsi="Cambria" w:cs="Cambria" w:eastAsia="Cambria"/>
+          <w:b/>
+          <w:color w:val="4F81BD"/>
+          <w:spacing w:val="0"/>
+          <w:position w:val="0"/>
+          <w:sz w:val="28"/>
+          <w:shd w:fill="auto" w:val="clear"/>
+        </w:rPr>
+      </w:pPr>
+      <w:r>
+        <w:rPr>
+          <w:rFonts w:ascii="Cambria" w:hAnsi="Cambria" w:cs="Cambria" w:eastAsia="Cambria"/>
+          <w:color w:val="auto"/>
+          <w:spacing w:val="0"/>
+          <w:position w:val="0"/>
+          <w:sz w:val="22"/>
+          <w:shd w:fill="auto" w:val="clear"/>
+        </w:rPr>
+        <w:t xml:space="preserve">HttpClient(v2.2.0)</w:t>
+      </w:r>
+    </w:p>
+    <w:p>
+      <w:pPr>
+        <w:keepNext w:val="true"/>
+        <w:keepLines w:val="true"/>
+        <w:spacing w:before="200" w:after="0" w:line="240"/>
+        <w:ind w:right="0" w:left="0" w:firstLine="0"/>
+        <w:jc w:val="left"/>
+        <w:rPr>
+          <w:rFonts w:ascii="Cambria" w:hAnsi="Cambria" w:cs="Cambria" w:eastAsia="Cambria"/>
+          <w:b/>
+          <w:color w:val="4F81BD"/>
+          <w:spacing w:val="0"/>
+          <w:position w:val="0"/>
+          <w:sz w:val="28"/>
+          <w:shd w:fill="auto" w:val="clear"/>
+        </w:rPr>
+      </w:pPr>
+    </w:p>
+    <w:p>
+      <w:pPr>
+        <w:keepNext w:val="true"/>
+        <w:keepLines w:val="true"/>
+        <w:spacing w:before="200" w:after="0" w:line="240"/>
+        <w:ind w:right="0" w:left="0" w:firstLine="0"/>
+        <w:jc w:val="left"/>
+        <w:rPr>
+          <w:rFonts w:ascii="Calibri" w:hAnsi="Calibri" w:cs="Calibri" w:eastAsia="Calibri"/>
+          <w:b/>
+          <w:color w:val="4F81BD"/>
+          <w:spacing w:val="0"/>
+          <w:position w:val="0"/>
+          <w:sz w:val="26"/>
+          <w:shd w:fill="auto" w:val="clear"/>
+        </w:rPr>
+      </w:pPr>
+      <w:r>
+        <w:rPr>
+          <w:rFonts w:ascii="Cambria" w:hAnsi="Cambria" w:cs="Cambria" w:eastAsia="Cambria"/>
+          <w:b/>
+          <w:color w:val="4F81BD"/>
+          <w:spacing w:val="0"/>
+          <w:position w:val="0"/>
+          <w:sz w:val="28"/>
+          <w:shd w:fill="auto" w:val="clear"/>
+        </w:rPr>
+        <w:t xml:space="preserve">2- Build Binaries:</w:t>
+      </w:r>
+    </w:p>
+    <w:p>
+      <w:pPr>
+        <w:keepNext w:val="true"/>
+        <w:keepLines w:val="true"/>
+        <w:numPr>
+          <w:ilvl w:val="0"/>
+          <w:numId w:val="15"/>
+        </w:numPr>
+        <w:spacing w:before="200" w:after="0" w:line="240"/>
+        <w:ind w:right="0" w:left="720" w:hanging="578"/>
+        <w:jc w:val="left"/>
+        <w:rPr>
+          <w:rFonts w:ascii="Calibri" w:hAnsi="Calibri" w:cs="Calibri" w:eastAsia="Calibri"/>
+          <w:b/>
+          <w:color w:val="4F81BD"/>
+          <w:spacing w:val="0"/>
+          <w:position w:val="0"/>
+          <w:sz w:val="22"/>
+          <w:shd w:fill="auto" w:val="clear"/>
+        </w:rPr>
+      </w:pPr>
+      <w:r>
+        <w:rPr>
+          <w:rFonts w:ascii="Cambria" w:hAnsi="Cambria" w:cs="Cambria" w:eastAsia="Cambria"/>
+          <w:color w:val="auto"/>
+          <w:spacing w:val="0"/>
+          <w:position w:val="0"/>
+          <w:sz w:val="22"/>
+          <w:shd w:fill="auto" w:val="clear"/>
+        </w:rPr>
+        <w:t xml:space="preserve">Download the </w:t>
+      </w:r>
+      <w:r>
+        <w:rPr>
+          <w:rFonts w:ascii="Cambria" w:hAnsi="Cambria" w:cs="Cambria" w:eastAsia="Cambria"/>
+          <w:color w:val="004DBB"/>
+          <w:spacing w:val="0"/>
+          <w:position w:val="0"/>
+          <w:sz w:val="22"/>
+          <w:shd w:fill="auto" w:val="clear"/>
+        </w:rPr>
+        <w:t xml:space="preserve">flash_download_tool </w:t>
+      </w:r>
+      <w:r>
+        <w:rPr>
+          <w:rFonts w:ascii="Cambria" w:hAnsi="Cambria" w:cs="Cambria" w:eastAsia="Cambria"/>
+          <w:color w:val="auto"/>
+          <w:spacing w:val="0"/>
+          <w:position w:val="0"/>
+          <w:sz w:val="22"/>
+          <w:shd w:fill="auto" w:val="clear"/>
+        </w:rPr>
+        <w:t xml:space="preserve">from the bellow link and install. </w:t>
+      </w:r>
+      <w:hyperlink xmlns:r="http://schemas.openxmlformats.org/officeDocument/2006/relationships" r:id="docRId1">
+        <w:r>
+          <w:rPr>
+            <w:rFonts w:ascii="Calibri" w:hAnsi="Calibri" w:cs="Calibri" w:eastAsia="Calibri"/>
+            <w:b/>
+            <w:color w:val="0000FF"/>
+            <w:spacing w:val="0"/>
+            <w:position w:val="0"/>
+            <w:sz w:val="22"/>
+            <w:u w:val="single"/>
+            <w:shd w:fill="auto" w:val="clear"/>
+          </w:rPr>
+          <w:t xml:space="preserve">https://github.com/Makerfabs/esp_tool</w:t>
+        </w:r>
+      </w:hyperlink>
+    </w:p>
+    <w:p>
+      <w:pPr>
+        <w:keepNext w:val="true"/>
+        <w:keepLines w:val="true"/>
+        <w:numPr>
+          <w:ilvl w:val="0"/>
+          <w:numId w:val="15"/>
+        </w:numPr>
+        <w:spacing w:before="200" w:after="0" w:line="240"/>
+        <w:ind w:right="0" w:left="720" w:hanging="578"/>
+        <w:jc w:val="left"/>
+        <w:rPr>
+          <w:rFonts w:ascii="Calibri" w:hAnsi="Calibri" w:cs="Calibri" w:eastAsia="Calibri"/>
+          <w:b/>
+          <w:color w:val="4F81BD"/>
+          <w:spacing w:val="0"/>
+          <w:position w:val="0"/>
+          <w:sz w:val="22"/>
+          <w:shd w:fill="auto" w:val="clear"/>
+        </w:rPr>
+      </w:pPr>
+      <w:r>
+        <w:rPr>
+          <w:rFonts w:ascii="Calibri" w:hAnsi="Calibri" w:cs="Calibri" w:eastAsia="Calibri"/>
+          <w:b/>
+          <w:color w:val="auto"/>
+          <w:spacing w:val="0"/>
+          <w:position w:val="0"/>
+          <w:sz w:val="22"/>
+          <w:shd w:fill="auto" w:val="clear"/>
+        </w:rPr>
+        <w:t xml:space="preserve">After installation open the </w:t>
+      </w:r>
+      <w:r>
+        <w:rPr>
+          <w:rFonts w:ascii="Cambria" w:hAnsi="Cambria" w:cs="Cambria" w:eastAsia="Cambria"/>
+          <w:color w:val="004DBB"/>
+          <w:spacing w:val="0"/>
+          <w:position w:val="0"/>
+          <w:sz w:val="22"/>
+          <w:shd w:fill="auto" w:val="clear"/>
+        </w:rPr>
+        <w:t xml:space="preserve">flash_download_tool </w:t>
+      </w:r>
+      <w:r>
+        <w:rPr>
+          <w:rFonts w:ascii="Cambria" w:hAnsi="Cambria" w:cs="Cambria" w:eastAsia="Cambria"/>
+          <w:color w:val="auto"/>
+          <w:spacing w:val="0"/>
+          <w:position w:val="0"/>
+          <w:sz w:val="22"/>
+          <w:shd w:fill="auto" w:val="clear"/>
+        </w:rPr>
+        <w:t xml:space="preserve">and setup the board.</w:t>
+      </w:r>
+    </w:p>
+    <w:p>
+      <w:pPr>
+        <w:keepNext w:val="true"/>
+        <w:keepLines w:val="true"/>
+        <w:spacing w:before="200" w:after="0" w:line="240"/>
+        <w:ind w:right="0" w:left="0" w:firstLine="0"/>
+        <w:jc w:val="left"/>
+        <w:rPr>
+          <w:rFonts w:ascii="Calibri" w:hAnsi="Calibri" w:cs="Calibri" w:eastAsia="Calibri"/>
+          <w:b/>
+          <w:color w:val="4F81BD"/>
+          <w:spacing w:val="0"/>
+          <w:position w:val="0"/>
+          <w:sz w:val="22"/>
+          <w:shd w:fill="auto" w:val="clear"/>
+        </w:rPr>
+      </w:pPr>
+      <w:r>
+        <w:rPr>
+          <w:rFonts w:ascii="Calibri" w:hAnsi="Calibri" w:cs="Calibri" w:eastAsia="Calibri"/>
+          <w:b/>
+          <w:color w:val="4F81BD"/>
+          <w:spacing w:val="0"/>
+          <w:position w:val="0"/>
+          <w:sz w:val="22"/>
+          <w:shd w:fill="auto" w:val="clear"/>
+        </w:rPr>
+        <w:tab/>
+      </w:r>
+      <w:r>
+        <w:object w:dxaOrig="3361" w:dyaOrig="3178">
+          <v:rect xmlns:o="urn:schemas-microsoft-com:office:office" xmlns:v="urn:schemas-microsoft-com:vml" id="rectole0000000000" style="width:168.050000pt;height:158.900000pt" o:preferrelative="t" o:ole="">
+            <o:lock v:ext="edit"/>
+            <v:imagedata xmlns:r="http://schemas.openxmlformats.org/officeDocument/2006/relationships" r:id="docRId3" o:title=""/>
+          </v:rect>
+          <o:OLEObject xmlns:r="http://schemas.openxmlformats.org/officeDocument/2006/relationships" xmlns:o="urn:schemas-microsoft-com:office:office" Type="Embed" ProgID="StaticDib" DrawAspect="Content" ObjectID="0000000000" ShapeID="rectole0000000000" r:id="docRId2"/>
+        </w:object>
+      </w:r>
+    </w:p>
+    <w:p>
+      <w:pPr>
+        <w:keepNext w:val="true"/>
+        <w:keepLines w:val="true"/>
+        <w:numPr>
+          <w:ilvl w:val="0"/>
+          <w:numId w:val="17"/>
+        </w:numPr>
+        <w:spacing w:before="200" w:after="0" w:line="240"/>
+        <w:ind w:right="0" w:left="720" w:hanging="578"/>
+        <w:jc w:val="left"/>
+        <w:rPr>
+          <w:rFonts w:ascii="Calibri" w:hAnsi="Calibri" w:cs="Calibri" w:eastAsia="Calibri"/>
+          <w:b/>
+          <w:color w:val="4F81BD"/>
+          <w:spacing w:val="0"/>
+          <w:position w:val="0"/>
+          <w:sz w:val="22"/>
+          <w:shd w:fill="auto" w:val="clear"/>
+        </w:rPr>
+      </w:pPr>
+      <w:r>
+        <w:rPr>
+          <w:rFonts w:ascii="Calibri" w:hAnsi="Calibri" w:cs="Calibri" w:eastAsia="Calibri"/>
+          <w:color w:val="auto"/>
+          <w:spacing w:val="0"/>
+          <w:position w:val="0"/>
+          <w:sz w:val="22"/>
+          <w:shd w:fill="auto" w:val="clear"/>
+        </w:rPr>
+        <w:t xml:space="preserve">Click on the three dots to open file browser.</w:t>
+      </w:r>
+    </w:p>
+    <w:p>
+      <w:pPr>
+        <w:keepNext w:val="true"/>
+        <w:keepLines w:val="true"/>
+        <w:spacing w:before="200" w:after="0" w:line="240"/>
+        <w:ind w:right="0" w:left="0" w:firstLine="0"/>
+        <w:jc w:val="left"/>
+        <w:rPr>
+          <w:rFonts w:ascii="Calibri" w:hAnsi="Calibri" w:cs="Calibri" w:eastAsia="Calibri"/>
+          <w:b/>
+          <w:color w:val="4F81BD"/>
+          <w:spacing w:val="0"/>
+          <w:position w:val="0"/>
+          <w:sz w:val="22"/>
+          <w:shd w:fill="auto" w:val="clear"/>
+        </w:rPr>
+      </w:pPr>
+      <w:r>
+        <w:rPr>
+          <w:rFonts w:ascii="Calibri" w:hAnsi="Calibri" w:cs="Calibri" w:eastAsia="Calibri"/>
+          <w:b/>
+          <w:color w:val="4F81BD"/>
+          <w:spacing w:val="0"/>
+          <w:position w:val="0"/>
+          <w:sz w:val="22"/>
+          <w:shd w:fill="auto" w:val="clear"/>
+        </w:rPr>
+        <w:br/>
+        <w:tab/>
+      </w:r>
+      <w:r>
+        <w:object w:dxaOrig="6013" w:dyaOrig="7653">
+          <v:rect xmlns:o="urn:schemas-microsoft-com:office:office" xmlns:v="urn:schemas-microsoft-com:vml" id="rectole0000000001" style="width:300.650000pt;height:382.650000pt" o:preferrelative="t" o:ole="">
+            <o:lock v:ext="edit"/>
+            <v:imagedata xmlns:r="http://schemas.openxmlformats.org/officeDocument/2006/relationships" r:id="docRId5" o:title=""/>
+          </v:rect>
+          <o:OLEObject xmlns:r="http://schemas.openxmlformats.org/officeDocument/2006/relationships" xmlns:o="urn:schemas-microsoft-com:office:office" Type="Embed" ProgID="StaticDib" DrawAspect="Content" ObjectID="0000000001" ShapeID="rectole0000000001" r:id="docRId4"/>
+        </w:object>
+      </w:r>
+    </w:p>
+    <w:p>
+      <w:pPr>
+        <w:keepNext w:val="true"/>
+        <w:keepLines w:val="true"/>
+        <w:numPr>
+          <w:ilvl w:val="0"/>
+          <w:numId w:val="19"/>
+        </w:numPr>
+        <w:spacing w:before="200" w:after="0" w:line="240"/>
+        <w:ind w:right="0" w:left="720" w:hanging="578"/>
+        <w:jc w:val="left"/>
+        <w:rPr>
+          <w:rFonts w:ascii="Calibri" w:hAnsi="Calibri" w:cs="Calibri" w:eastAsia="Calibri"/>
+          <w:b/>
+          <w:color w:val="4F81BD"/>
+          <w:spacing w:val="0"/>
+          <w:position w:val="0"/>
+          <w:sz w:val="22"/>
+          <w:shd w:fill="auto" w:val="clear"/>
+        </w:rPr>
+      </w:pPr>
+      <w:r>
+        <w:rPr>
+          <w:rFonts w:ascii="Calibri" w:hAnsi="Calibri" w:cs="Calibri" w:eastAsia="Calibri"/>
+          <w:b/>
+          <w:color w:val="4F81BD"/>
+          <w:spacing w:val="0"/>
+          <w:position w:val="0"/>
+          <w:sz w:val="22"/>
+          <w:shd w:fill="auto" w:val="clear"/>
+        </w:rPr>
+        <w:t xml:space="preserve"> </w:t>
+      </w:r>
+      <w:r>
+        <w:rPr>
+          <w:rFonts w:ascii="Calibri" w:hAnsi="Calibri" w:cs="Calibri" w:eastAsia="Calibri"/>
+          <w:color w:val="auto"/>
+          <w:spacing w:val="0"/>
+          <w:position w:val="0"/>
+          <w:sz w:val="22"/>
+          <w:shd w:fill="auto" w:val="clear"/>
+        </w:rPr>
+        <w:t xml:space="preserve">Select the binary file from the directory and open.</w:t>
+      </w:r>
+    </w:p>
+    <w:p>
+      <w:pPr>
+        <w:keepNext w:val="true"/>
+        <w:keepLines w:val="true"/>
+        <w:spacing w:before="200" w:after="0" w:line="240"/>
+        <w:ind w:right="0" w:left="720" w:firstLine="0"/>
+        <w:jc w:val="left"/>
+        <w:rPr>
+          <w:rFonts w:ascii="Calibri" w:hAnsi="Calibri" w:cs="Calibri" w:eastAsia="Calibri"/>
+          <w:b/>
+          <w:color w:val="4F81BD"/>
+          <w:spacing w:val="0"/>
+          <w:position w:val="0"/>
+          <w:sz w:val="22"/>
+          <w:shd w:fill="auto" w:val="clear"/>
+        </w:rPr>
+      </w:pPr>
+      <w:r>
+        <w:object w:dxaOrig="8402" w:dyaOrig="4920">
+          <v:rect xmlns:o="urn:schemas-microsoft-com:office:office" xmlns:v="urn:schemas-microsoft-com:vml" id="rectole0000000002" style="width:420.100000pt;height:246.000000pt" o:preferrelative="t" o:ole="">
+            <o:lock v:ext="edit"/>
+            <v:imagedata xmlns:r="http://schemas.openxmlformats.org/officeDocument/2006/relationships" r:id="docRId7" o:title=""/>
+          </v:rect>
+          <o:OLEObject xmlns:r="http://schemas.openxmlformats.org/officeDocument/2006/relationships" xmlns:o="urn:schemas-microsoft-com:office:office" Type="Embed" ProgID="StaticDib" DrawAspect="Content" ObjectID="0000000002" ShapeID="rectole0000000002" r:id="docRId6"/>
+        </w:object>
+      </w:r>
+    </w:p>
+    <w:p>
+      <w:pPr>
+        <w:keepNext w:val="true"/>
+        <w:keepLines w:val="true"/>
+        <w:numPr>
+          <w:ilvl w:val="0"/>
+          <w:numId w:val="21"/>
+        </w:numPr>
+        <w:spacing w:before="200" w:after="0" w:line="240"/>
+        <w:ind w:right="0" w:left="720" w:hanging="578"/>
+        <w:jc w:val="left"/>
+        <w:rPr>
+          <w:rFonts w:ascii="Calibri" w:hAnsi="Calibri" w:cs="Calibri" w:eastAsia="Calibri"/>
+          <w:b/>
+          <w:color w:val="4F81BD"/>
+          <w:spacing w:val="0"/>
+          <w:position w:val="0"/>
+          <w:sz w:val="22"/>
+          <w:shd w:fill="auto" w:val="clear"/>
+        </w:rPr>
+      </w:pPr>
+      <w:r>
+        <w:rPr>
+          <w:rFonts w:ascii="Calibri" w:hAnsi="Calibri" w:cs="Calibri" w:eastAsia="Calibri"/>
+          <w:color w:val="auto"/>
+          <w:spacing w:val="0"/>
+          <w:position w:val="0"/>
+          <w:sz w:val="22"/>
+          <w:shd w:fill="auto" w:val="clear"/>
+        </w:rPr>
+        <w:t xml:space="preserve">Make sure the address should </w:t>
+      </w:r>
+      <w:r>
+        <w:rPr>
+          <w:rFonts w:ascii="Calibri" w:hAnsi="Calibri" w:cs="Calibri" w:eastAsia="Calibri"/>
+          <w:b/>
+          <w:color w:val="4F81BD"/>
+          <w:spacing w:val="0"/>
+          <w:position w:val="0"/>
+          <w:sz w:val="22"/>
+          <w:shd w:fill="auto" w:val="clear"/>
+        </w:rPr>
+        <w:t xml:space="preserve">0x00.</w:t>
+      </w:r>
+    </w:p>
+    <w:p>
+      <w:pPr>
+        <w:keepNext w:val="true"/>
+        <w:keepLines w:val="true"/>
+        <w:numPr>
+          <w:ilvl w:val="0"/>
+          <w:numId w:val="21"/>
+        </w:numPr>
+        <w:spacing w:before="200" w:after="0" w:line="240"/>
+        <w:ind w:right="0" w:left="720" w:hanging="578"/>
+        <w:jc w:val="left"/>
+        <w:rPr>
+          <w:rFonts w:ascii="Calibri" w:hAnsi="Calibri" w:cs="Calibri" w:eastAsia="Calibri"/>
+          <w:b/>
+          <w:color w:val="4F81BD"/>
+          <w:spacing w:val="0"/>
+          <w:position w:val="0"/>
+          <w:sz w:val="22"/>
+          <w:shd w:fill="auto" w:val="clear"/>
+        </w:rPr>
+      </w:pPr>
+      <w:r>
+        <w:rPr>
+          <w:rFonts w:ascii="Calibri" w:hAnsi="Calibri" w:cs="Calibri" w:eastAsia="Calibri"/>
+          <w:color w:val="auto"/>
+          <w:spacing w:val="0"/>
+          <w:position w:val="0"/>
+          <w:sz w:val="22"/>
+          <w:shd w:fill="auto" w:val="clear"/>
+        </w:rPr>
+        <w:t xml:space="preserve">Select the port and Baudrate the click on start.</w:t>
+      </w:r>
+    </w:p>
+    <w:p>
+      <w:pPr>
+        <w:keepNext w:val="true"/>
+        <w:keepLines w:val="true"/>
+        <w:spacing w:before="200" w:after="0" w:line="240"/>
+        <w:ind w:right="0" w:left="0" w:firstLine="0"/>
+        <w:jc w:val="left"/>
+        <w:rPr>
+          <w:rFonts w:ascii="Calibri" w:hAnsi="Calibri" w:cs="Calibri" w:eastAsia="Calibri"/>
+          <w:color w:val="auto"/>
+          <w:spacing w:val="0"/>
+          <w:position w:val="0"/>
+          <w:sz w:val="22"/>
+          <w:shd w:fill="auto" w:val="clear"/>
+        </w:rPr>
+      </w:pPr>
+      <w:r>
+        <w:rPr>
+          <w:rFonts w:ascii="Calibri" w:hAnsi="Calibri" w:cs="Calibri" w:eastAsia="Calibri"/>
+          <w:color w:val="auto"/>
+          <w:spacing w:val="0"/>
+          <w:position w:val="0"/>
+          <w:sz w:val="22"/>
+          <w:shd w:fill="auto" w:val="clear"/>
+        </w:rPr>
+        <w:tab/>
+      </w:r>
+      <w:r>
+        <w:object w:dxaOrig="4433" w:dyaOrig="6155">
+          <v:rect xmlns:o="urn:schemas-microsoft-com:office:office" xmlns:v="urn:schemas-microsoft-com:vml" id="rectole0000000003" style="width:221.650000pt;height:307.750000pt" o:preferrelative="t" o:ole="">
+            <o:lock v:ext="edit"/>
+            <v:imagedata xmlns:r="http://schemas.openxmlformats.org/officeDocument/2006/relationships" r:id="docRId9" o:title=""/>
+          </v:rect>
+          <o:OLEObject xmlns:r="http://schemas.openxmlformats.org/officeDocument/2006/relationships" xmlns:o="urn:schemas-microsoft-com:office:office" Type="Embed" ProgID="StaticDib" DrawAspect="Content" ObjectID="0000000003" ShapeID="rectole0000000003" r:id="docRId8"/>
+        </w:object>
+      </w:r>
+    </w:p>
+    <w:p>
+      <w:pPr>
+        <w:keepNext w:val="true"/>
+        <w:keepLines w:val="true"/>
+        <w:numPr>
+          <w:ilvl w:val="0"/>
+          <w:numId w:val="23"/>
+        </w:numPr>
+        <w:spacing w:before="200" w:after="0" w:line="240"/>
+        <w:ind w:right="0" w:left="720" w:hanging="578"/>
+        <w:jc w:val="left"/>
+        <w:rPr>
+          <w:rFonts w:ascii="Calibri" w:hAnsi="Calibri" w:cs="Calibri" w:eastAsia="Calibri"/>
+          <w:b/>
+          <w:color w:val="4F81BD"/>
+          <w:spacing w:val="0"/>
+          <w:position w:val="0"/>
+          <w:sz w:val="22"/>
+          <w:shd w:fill="auto" w:val="clear"/>
+        </w:rPr>
+      </w:pPr>
+      <w:r>
+        <w:rPr>
+          <w:rFonts w:ascii="Calibri" w:hAnsi="Calibri" w:cs="Calibri" w:eastAsia="Calibri"/>
+          <w:color w:val="auto"/>
+          <w:spacing w:val="0"/>
+          <w:position w:val="0"/>
+          <w:sz w:val="22"/>
+          <w:shd w:fill="auto" w:val="clear"/>
+        </w:rPr>
+        <w:t xml:space="preserve">Binary file has been upload on ESP32.</w:t>
+      </w:r>
+    </w:p>
+    <w:p>
+      <w:pPr>
+        <w:keepNext w:val="true"/>
+        <w:keepLines w:val="true"/>
+        <w:spacing w:before="200" w:after="0" w:line="240"/>
+        <w:ind w:right="0" w:left="0" w:firstLine="0"/>
+        <w:jc w:val="left"/>
+        <w:rPr>
+          <w:rFonts w:ascii="Calibri" w:hAnsi="Calibri" w:cs="Calibri" w:eastAsia="Calibri"/>
+          <w:color w:val="auto"/>
+          <w:spacing w:val="0"/>
+          <w:position w:val="0"/>
+          <w:sz w:val="22"/>
+          <w:shd w:fill="auto" w:val="clear"/>
+        </w:rPr>
+      </w:pPr>
+      <w:r>
+        <w:rPr>
+          <w:rFonts w:ascii="Calibri" w:hAnsi="Calibri" w:cs="Calibri" w:eastAsia="Calibri"/>
+          <w:color w:val="auto"/>
+          <w:spacing w:val="0"/>
+          <w:position w:val="0"/>
+          <w:sz w:val="22"/>
+          <w:shd w:fill="auto" w:val="clear"/>
+        </w:rPr>
+        <w:tab/>
+      </w:r>
+      <w:r>
+        <w:object w:dxaOrig="3907" w:dyaOrig="5062">
+          <v:rect xmlns:o="urn:schemas-microsoft-com:office:office" xmlns:v="urn:schemas-microsoft-com:vml" id="rectole0000000004" style="width:195.350000pt;height:253.100000pt" o:preferrelative="t" o:ole="">
+            <o:lock v:ext="edit"/>
+            <v:imagedata xmlns:r="http://schemas.openxmlformats.org/officeDocument/2006/relationships" r:id="docRId11" o:title=""/>
+          </v:rect>
+          <o:OLEObject xmlns:r="http://schemas.openxmlformats.org/officeDocument/2006/relationships" xmlns:o="urn:schemas-microsoft-com:office:office" Type="Embed" ProgID="StaticDib" DrawAspect="Content" ObjectID="0000000004" ShapeID="rectole0000000004" r:id="docRId10"/>
+        </w:object>
+      </w:r>
+    </w:p>
+    <w:p>
+      <w:pPr>
+        <w:keepNext w:val="true"/>
+        <w:keepLines w:val="true"/>
+        <w:numPr>
+          <w:ilvl w:val="0"/>
+          <w:numId w:val="25"/>
+        </w:numPr>
+        <w:spacing w:before="200" w:after="0" w:line="240"/>
+        <w:ind w:right="0" w:left="720" w:hanging="578"/>
+        <w:jc w:val="left"/>
+        <w:rPr>
+          <w:rFonts w:ascii="Calibri" w:hAnsi="Calibri" w:cs="Calibri" w:eastAsia="Calibri"/>
+          <w:b/>
+          <w:color w:val="4F81BD"/>
+          <w:spacing w:val="0"/>
+          <w:position w:val="0"/>
+          <w:sz w:val="22"/>
+          <w:shd w:fill="auto" w:val="clear"/>
+        </w:rPr>
+      </w:pPr>
+      <w:r>
+        <w:rPr>
+          <w:rFonts w:ascii="Calibri" w:hAnsi="Calibri" w:cs="Calibri" w:eastAsia="Calibri"/>
+          <w:b/>
+          <w:color w:val="004DBB"/>
+          <w:spacing w:val="0"/>
+          <w:position w:val="0"/>
+          <w:sz w:val="22"/>
+          <w:shd w:fill="auto" w:val="clear"/>
+        </w:rPr>
+        <w:t xml:space="preserve">NOTE:</w:t>
+      </w:r>
+      <w:r>
+        <w:rPr>
+          <w:rFonts w:ascii="Calibri" w:hAnsi="Calibri" w:cs="Calibri" w:eastAsia="Calibri"/>
+          <w:color w:val="004DBB"/>
+          <w:spacing w:val="0"/>
+          <w:position w:val="0"/>
+          <w:sz w:val="22"/>
+          <w:shd w:fill="auto" w:val="clear"/>
+        </w:rPr>
+        <w:t xml:space="preserve"> Make sure same COM port shouldn't be open (like Serial Monitor in Arduino IDE) other wise COM FAIL error occured.</w:t>
+      </w:r>
+    </w:p>
+    <w:p>
+      <w:pPr>
+        <w:keepNext w:val="true"/>
+        <w:keepLines w:val="true"/>
+        <w:spacing w:before="200" w:after="0" w:line="240"/>
+        <w:ind w:right="0" w:left="0" w:firstLine="0"/>
+        <w:jc w:val="left"/>
+        <w:rPr>
+          <w:rFonts w:ascii="Calibri" w:hAnsi="Calibri" w:cs="Calibri" w:eastAsia="Calibri"/>
+          <w:b/>
+          <w:color w:val="4F81BD"/>
+          <w:spacing w:val="0"/>
+          <w:position w:val="0"/>
+          <w:sz w:val="26"/>
+          <w:shd w:fill="auto" w:val="clear"/>
+        </w:rPr>
+      </w:pPr>
+      <w:r>
+        <w:rPr>
+          <w:rFonts w:ascii="Cambria" w:hAnsi="Cambria" w:cs="Cambria" w:eastAsia="Cambria"/>
+          <w:b/>
+          <w:color w:val="4F81BD"/>
+          <w:spacing w:val="0"/>
+          <w:position w:val="0"/>
+          <w:sz w:val="28"/>
+          <w:shd w:fill="auto" w:val="clear"/>
+        </w:rPr>
+        <w:t xml:space="preserve">3- Setup DataBase and Server:</w:t>
+      </w:r>
+    </w:p>
+    <w:p>
+      <w:pPr>
+        <w:keepNext w:val="true"/>
+        <w:keepLines w:val="true"/>
+        <w:spacing w:before="200" w:after="0" w:line="276"/>
+        <w:ind w:right="0" w:left="0" w:firstLine="0"/>
+        <w:jc w:val="left"/>
+        <w:rPr>
           <w:rFonts w:ascii="Calibri" w:hAnsi="Calibri" w:cs="Calibri" w:eastAsia="Calibri"/>
           <w:b/>
           <w:color w:val="4F81BD"/>
@@ -166,12 +1849,12 @@
         </w:rPr>
       </w:pPr>
       <w:r>
-        <w:object w:dxaOrig="7896" w:dyaOrig="1477">
-          <v:rect xmlns:o="urn:schemas-microsoft-com:office:office" xmlns:v="urn:schemas-microsoft-com:vml" id="rectole0000000000" style="width:394.800000pt;height:73.850000pt" o:preferrelative="t" o:ole="">
+        <w:object w:dxaOrig="8099" w:dyaOrig="1518">
+          <v:rect xmlns:o="urn:schemas-microsoft-com:office:office" xmlns:v="urn:schemas-microsoft-com:vml" id="rectole0000000005" style="width:404.950000pt;height:75.900000pt" o:preferrelative="t" o:ole="">
             <o:lock v:ext="edit"/>
-            <v:imagedata xmlns:r="http://schemas.openxmlformats.org/officeDocument/2006/relationships" r:id="docRId1" o:title=""/>
+            <v:imagedata xmlns:r="http://schemas.openxmlformats.org/officeDocument/2006/relationships" r:id="docRId13" o:title=""/>
           </v:rect>
-          <o:OLEObject xmlns:r="http://schemas.openxmlformats.org/officeDocument/2006/relationships" xmlns:o="urn:schemas-microsoft-com:office:office" Type="Embed" ProgID="StaticDib" DrawAspect="Content" ObjectID="0000000000" ShapeID="rectole0000000000" r:id="docRId0"/>
+          <o:OLEObject xmlns:r="http://schemas.openxmlformats.org/officeDocument/2006/relationships" xmlns:o="urn:schemas-microsoft-com:office:office" Type="Embed" ProgID="StaticDib" DrawAspect="Content" ObjectID="0000000005" ShapeID="rectole0000000005" r:id="docRId12"/>
         </w:object>
       </w:r>
     </w:p>
@@ -306,8 +1989,9 @@
         <w:ind w:right="0" w:left="0" w:firstLine="0"/>
         <w:jc w:val="left"/>
         <w:rPr>
-          <w:rFonts w:ascii="Cambria" w:hAnsi="Cambria" w:cs="Cambria" w:eastAsia="Cambria"/>
-          <w:color w:val="auto"/>
+          <w:rFonts w:ascii="Calibri" w:hAnsi="Calibri" w:cs="Calibri" w:eastAsia="Calibri"/>
+          <w:b/>
+          <w:color w:val="4F81BD"/>
           <w:spacing w:val="0"/>
           <w:position w:val="0"/>
           <w:sz w:val="22"/>
@@ -364,14 +2048,14 @@
           <w:sz w:val="22"/>
           <w:shd w:fill="auto" w:val="clear"/>
         </w:rPr>
-        <w:t xml:space="preserve"> Verification:</w:t>
+        <w:t xml:space="preserve">Verification:</w:t>
       </w:r>
     </w:p>
     <w:p>
       <w:pPr>
         <w:numPr>
           <w:ilvl w:val="0"/>
-          <w:numId w:val="12"/>
+          <w:numId w:val="37"/>
         </w:numPr>
         <w:tabs>
           <w:tab w:val="left" w:pos="360" w:leader="none"/>
@@ -418,12 +2102,12 @@
         </w:rPr>
       </w:pPr>
       <w:r>
-        <w:object w:dxaOrig="9151" w:dyaOrig="3907">
-          <v:rect xmlns:o="urn:schemas-microsoft-com:office:office" xmlns:v="urn:schemas-microsoft-com:vml" id="rectole0000000001" style="width:457.550000pt;height:195.350000pt" o:preferrelative="t" o:ole="">
+        <w:object w:dxaOrig="9394" w:dyaOrig="3988">
+          <v:rect xmlns:o="urn:schemas-microsoft-com:office:office" xmlns:v="urn:schemas-microsoft-com:vml" id="rectole0000000006" style="width:469.700000pt;height:199.400000pt" o:preferrelative="t" o:ole="">
             <o:lock v:ext="edit"/>
-            <v:imagedata xmlns:r="http://schemas.openxmlformats.org/officeDocument/2006/relationships" r:id="docRId3" o:title=""/>
+            <v:imagedata xmlns:r="http://schemas.openxmlformats.org/officeDocument/2006/relationships" r:id="docRId15" o:title=""/>
           </v:rect>
-          <o:OLEObject xmlns:r="http://schemas.openxmlformats.org/officeDocument/2006/relationships" xmlns:o="urn:schemas-microsoft-com:office:office" Type="Embed" ProgID="StaticDib" DrawAspect="Content" ObjectID="0000000001" ShapeID="rectole0000000001" r:id="docRId2"/>
+          <o:OLEObject xmlns:r="http://schemas.openxmlformats.org/officeDocument/2006/relationships" xmlns:o="urn:schemas-microsoft-com:office:office" Type="Embed" ProgID="StaticDib" DrawAspect="Content" ObjectID="0000000006" ShapeID="rectole0000000006" r:id="docRId14"/>
         </w:object>
       </w:r>
     </w:p>
@@ -503,88 +2187,66 @@
     </w:p>
     <w:p>
       <w:pPr>
-        <w:keepNext w:val="true"/>
-        <w:keepLines w:val="true"/>
-        <w:spacing w:before="200" w:after="0" w:line="276"/>
-        <w:ind w:right="0" w:left="0" w:firstLine="0"/>
-        <w:jc w:val="left"/>
-        <w:rPr>
-          <w:rFonts w:ascii="Calibri" w:hAnsi="Calibri" w:cs="Calibri" w:eastAsia="Calibri"/>
-          <w:b/>
-          <w:color w:val="4F81BD"/>
-          <w:spacing w:val="0"/>
-          <w:position w:val="0"/>
-          <w:sz w:val="22"/>
-          <w:shd w:fill="auto" w:val="clear"/>
-        </w:rPr>
-      </w:pPr>
-      <w:r>
-        <w:rPr>
-          <w:rFonts w:ascii="Calibri" w:hAnsi="Calibri" w:cs="Calibri" w:eastAsia="Calibri"/>
-          <w:b/>
-          <w:color w:val="4F81BD"/>
-          <w:spacing w:val="0"/>
-          <w:position w:val="0"/>
-          <w:sz w:val="22"/>
-          <w:shd w:fill="auto" w:val="clear"/>
-        </w:rPr>
-        <w:t xml:space="preserve"> Configuration:</w:t>
-      </w:r>
-    </w:p>
-    <w:p>
-      <w:pPr>
-        <w:keepNext w:val="true"/>
-        <w:keepLines w:val="true"/>
-        <w:spacing w:before="200" w:after="0" w:line="240"/>
-        <w:ind w:right="0" w:left="0" w:firstLine="0"/>
-        <w:jc w:val="left"/>
-        <w:rPr>
-          <w:rFonts w:ascii="Cambria" w:hAnsi="Cambria" w:cs="Cambria" w:eastAsia="Cambria"/>
-          <w:color w:val="auto"/>
-          <w:spacing w:val="0"/>
-          <w:position w:val="0"/>
-          <w:sz w:val="22"/>
-          <w:shd w:fill="auto" w:val="clear"/>
-        </w:rPr>
-      </w:pPr>
-      <w:r>
-        <w:object w:dxaOrig="7896" w:dyaOrig="1477">
-          <v:rect xmlns:o="urn:schemas-microsoft-com:office:office" xmlns:v="urn:schemas-microsoft-com:vml" id="rectole0000000002" style="width:394.800000pt;height:73.850000pt" o:preferrelative="t" o:ole="">
+        <w:spacing w:before="0" w:after="200" w:line="276"/>
+        <w:ind w:right="0" w:left="0" w:firstLine="0"/>
+        <w:jc w:val="left"/>
+        <w:rPr>
+          <w:rFonts w:ascii="Cambria" w:hAnsi="Cambria" w:cs="Cambria" w:eastAsia="Cambria"/>
+          <w:color w:val="auto"/>
+          <w:spacing w:val="0"/>
+          <w:position w:val="0"/>
+          <w:sz w:val="22"/>
+          <w:shd w:fill="auto" w:val="clear"/>
+        </w:rPr>
+      </w:pPr>
+      <w:r>
+        <w:rPr>
+          <w:rFonts w:ascii="Calibri" w:hAnsi="Calibri" w:cs="Calibri" w:eastAsia="Calibri"/>
+          <w:b/>
+          <w:color w:val="4F81BD"/>
+          <w:spacing w:val="0"/>
+          <w:position w:val="0"/>
+          <w:sz w:val="22"/>
+          <w:shd w:fill="auto" w:val="clear"/>
+        </w:rPr>
+        <w:t xml:space="preserve">Configuration:</w:t>
+      </w:r>
+      <w:r>
+        <w:object w:dxaOrig="8099" w:dyaOrig="1518">
+          <v:rect xmlns:o="urn:schemas-microsoft-com:office:office" xmlns:v="urn:schemas-microsoft-com:vml" id="rectole0000000007" style="width:404.950000pt;height:75.900000pt" o:preferrelative="t" o:ole="">
             <o:lock v:ext="edit"/>
-            <v:imagedata xmlns:r="http://schemas.openxmlformats.org/officeDocument/2006/relationships" r:id="docRId5" o:title=""/>
+            <v:imagedata xmlns:r="http://schemas.openxmlformats.org/officeDocument/2006/relationships" r:id="docRId17" o:title=""/>
           </v:rect>
-          <o:OLEObject xmlns:r="http://schemas.openxmlformats.org/officeDocument/2006/relationships" xmlns:o="urn:schemas-microsoft-com:office:office" Type="Embed" ProgID="StaticMetafile" DrawAspect="Content" ObjectID="0000000002" ShapeID="rectole0000000002" r:id="docRId4"/>
+          <o:OLEObject xmlns:r="http://schemas.openxmlformats.org/officeDocument/2006/relationships" xmlns:o="urn:schemas-microsoft-com:office:office" Type="Embed" ProgID="StaticMetafile" DrawAspect="Content" ObjectID="0000000007" ShapeID="rectole0000000007" r:id="docRId16"/>
         </w:object>
       </w:r>
     </w:p>
     <w:p>
       <w:pPr>
-        <w:keepNext w:val="true"/>
-        <w:keepLines w:val="true"/>
-        <w:spacing w:before="200" w:after="0" w:line="276"/>
-        <w:ind w:right="0" w:left="0" w:firstLine="0"/>
-        <w:jc w:val="left"/>
-        <w:rPr>
-          <w:rFonts w:ascii="Calibri" w:hAnsi="Calibri" w:cs="Calibri" w:eastAsia="Calibri"/>
-          <w:b/>
-          <w:color w:val="4F81BD"/>
-          <w:spacing w:val="0"/>
-          <w:position w:val="0"/>
-          <w:sz w:val="22"/>
-          <w:shd w:fill="auto" w:val="clear"/>
-        </w:rPr>
-      </w:pPr>
-      <w:r>
-        <w:rPr>
-          <w:rFonts w:ascii="Calibri" w:hAnsi="Calibri" w:cs="Calibri" w:eastAsia="Calibri"/>
-          <w:b/>
-          <w:color w:val="4F81BD"/>
-          <w:spacing w:val="0"/>
-          <w:position w:val="0"/>
-          <w:sz w:val="22"/>
-          <w:shd w:fill="auto" w:val="clear"/>
-        </w:rPr>
-        <w:t xml:space="preserve"> Server Setup:</w:t>
+        <w:spacing w:before="0" w:after="200" w:line="240"/>
+        <w:ind w:right="0" w:left="0" w:firstLine="0"/>
+        <w:jc w:val="left"/>
+        <w:rPr>
+          <w:rFonts w:ascii="Calibri" w:hAnsi="Calibri" w:cs="Calibri" w:eastAsia="Calibri"/>
+          <w:b/>
+          <w:color w:val="4F81BD"/>
+          <w:spacing w:val="0"/>
+          <w:position w:val="0"/>
+          <w:sz w:val="22"/>
+          <w:shd w:fill="auto" w:val="clear"/>
+        </w:rPr>
+      </w:pPr>
+      <w:r>
+        <w:rPr>
+          <w:rFonts w:ascii="Calibri" w:hAnsi="Calibri" w:cs="Calibri" w:eastAsia="Calibri"/>
+          <w:b/>
+          <w:color w:val="4F81BD"/>
+          <w:spacing w:val="0"/>
+          <w:position w:val="0"/>
+          <w:sz w:val="22"/>
+          <w:shd w:fill="auto" w:val="clear"/>
+        </w:rPr>
+        <w:t xml:space="preserve">Server Setup:</w:t>
       </w:r>
     </w:p>
     <w:p>
@@ -592,7 +2254,7 @@
         <w:tabs>
           <w:tab w:val="left" w:pos="360" w:leader="none"/>
         </w:tabs>
-        <w:spacing w:before="0" w:after="200" w:line="276"/>
+        <w:spacing w:before="0" w:after="0" w:line="360"/>
         <w:ind w:right="0" w:left="0" w:firstLine="0"/>
         <w:jc w:val="left"/>
         <w:rPr>
@@ -618,7 +2280,7 @@
     </w:p>
     <w:p>
       <w:pPr>
-        <w:spacing w:before="0" w:after="200" w:line="276"/>
+        <w:spacing w:before="0" w:after="0" w:line="360"/>
         <w:ind w:right="0" w:left="0" w:firstLine="0"/>
         <w:jc w:val="left"/>
         <w:rPr>
@@ -658,7 +2320,7 @@
         <w:tabs>
           <w:tab w:val="left" w:pos="360" w:leader="none"/>
         </w:tabs>
-        <w:spacing w:before="0" w:after="200" w:line="276"/>
+        <w:spacing w:before="0" w:after="0" w:line="360"/>
         <w:ind w:right="0" w:left="0" w:firstLine="0"/>
         <w:jc w:val="left"/>
         <w:rPr>
@@ -684,16 +2346,16 @@
     </w:p>
     <w:p>
       <w:pPr>
-        <w:spacing w:before="0" w:after="200" w:line="276"/>
-        <w:ind w:right="0" w:left="0" w:firstLine="0"/>
-        <w:jc w:val="left"/>
-        <w:rPr>
-          <w:rFonts w:ascii="Cambria" w:hAnsi="Cambria" w:cs="Cambria" w:eastAsia="Cambria"/>
-          <w:color w:val="auto"/>
-          <w:spacing w:val="0"/>
-          <w:position w:val="0"/>
-          <w:sz w:val="22"/>
-          <w:shd w:fill="auto" w:val="clear"/>
+        <w:spacing w:before="0" w:after="0" w:line="360"/>
+        <w:ind w:right="0" w:left="0" w:firstLine="0"/>
+        <w:jc w:val="left"/>
+        <w:rPr>
+          <w:rFonts w:ascii="Cambria" w:hAnsi="Cambria" w:cs="Cambria" w:eastAsia="Cambria"/>
+          <w:color w:val="auto"/>
+          <w:spacing w:val="0"/>
+          <w:position w:val="0"/>
+          <w:sz w:val="22"/>
+          <w:shd w:fill="C0C0C0" w:val="clear"/>
         </w:rPr>
       </w:pPr>
       <w:r>
@@ -721,7 +2383,22 @@
     </w:p>
     <w:p>
       <w:pPr>
-        <w:spacing w:before="0" w:after="200" w:line="276"/>
+        <w:spacing w:before="0" w:after="0" w:line="360"/>
+        <w:ind w:right="0" w:left="0" w:firstLine="0"/>
+        <w:jc w:val="left"/>
+        <w:rPr>
+          <w:rFonts w:ascii="Cambria" w:hAnsi="Cambria" w:cs="Cambria" w:eastAsia="Cambria"/>
+          <w:color w:val="auto"/>
+          <w:spacing w:val="0"/>
+          <w:position w:val="0"/>
+          <w:sz w:val="22"/>
+          <w:shd w:fill="auto" w:val="clear"/>
+        </w:rPr>
+      </w:pPr>
+    </w:p>
+    <w:p>
+      <w:pPr>
+        <w:spacing w:before="0" w:after="0" w:line="240"/>
         <w:ind w:right="0" w:left="0" w:firstLine="0"/>
         <w:jc w:val="left"/>
         <w:rPr>
@@ -749,7 +2426,7 @@
     </w:p>
     <w:p>
       <w:pPr>
-        <w:spacing w:before="0" w:after="200" w:line="276"/>
+        <w:spacing w:before="0" w:after="0" w:line="240"/>
         <w:ind w:right="0" w:left="0" w:firstLine="0"/>
         <w:jc w:val="left"/>
         <w:rPr>
@@ -778,25 +2455,26 @@
         <w:tabs>
           <w:tab w:val="left" w:pos="360" w:leader="none"/>
         </w:tabs>
-        <w:spacing w:before="0" w:after="200" w:line="240"/>
-        <w:ind w:right="0" w:left="0" w:firstLine="0"/>
-        <w:jc w:val="left"/>
-        <w:rPr>
-          <w:rFonts w:ascii="Cambria" w:hAnsi="Cambria" w:cs="Cambria" w:eastAsia="Cambria"/>
-          <w:color w:val="auto"/>
-          <w:spacing w:val="0"/>
-          <w:position w:val="0"/>
-          <w:sz w:val="22"/>
-          <w:shd w:fill="auto" w:val="clear"/>
-        </w:rPr>
-      </w:pPr>
-      <w:r>
-        <w:object w:dxaOrig="6357" w:dyaOrig="2713">
-          <v:rect xmlns:o="urn:schemas-microsoft-com:office:office" xmlns:v="urn:schemas-microsoft-com:vml" id="rectole0000000003" style="width:317.850000pt;height:135.650000pt" o:preferrelative="t" o:ole="">
+        <w:spacing w:before="0" w:after="0" w:line="240"/>
+        <w:ind w:right="0" w:left="0" w:firstLine="0"/>
+        <w:jc w:val="left"/>
+        <w:rPr>
+          <w:rFonts w:ascii="Calibri" w:hAnsi="Calibri" w:cs="Calibri" w:eastAsia="Calibri"/>
+          <w:b/>
+          <w:color w:val="4F81BD"/>
+          <w:spacing w:val="0"/>
+          <w:position w:val="0"/>
+          <w:sz w:val="22"/>
+          <w:shd w:fill="auto" w:val="clear"/>
+        </w:rPr>
+      </w:pPr>
+      <w:r>
+        <w:object w:dxaOrig="6621" w:dyaOrig="2227">
+          <v:rect xmlns:o="urn:schemas-microsoft-com:office:office" xmlns:v="urn:schemas-microsoft-com:vml" id="rectole0000000008" style="width:331.050000pt;height:111.350000pt" o:preferrelative="t" o:ole="">
             <o:lock v:ext="edit"/>
-            <v:imagedata xmlns:r="http://schemas.openxmlformats.org/officeDocument/2006/relationships" r:id="docRId7" o:title=""/>
+            <v:imagedata xmlns:r="http://schemas.openxmlformats.org/officeDocument/2006/relationships" r:id="docRId19" o:title=""/>
           </v:rect>
-          <o:OLEObject xmlns:r="http://schemas.openxmlformats.org/officeDocument/2006/relationships" xmlns:o="urn:schemas-microsoft-com:office:office" Type="Embed" ProgID="StaticDib" DrawAspect="Content" ObjectID="0000000003" ShapeID="rectole0000000003" r:id="docRId6"/>
+          <o:OLEObject xmlns:r="http://schemas.openxmlformats.org/officeDocument/2006/relationships" xmlns:o="urn:schemas-microsoft-com:office:office" Type="Embed" ProgID="StaticDib" DrawAspect="Content" ObjectID="0000000008" ShapeID="rectole0000000008" r:id="docRId18"/>
         </w:object>
       </w:r>
     </w:p>
@@ -817,112 +2495,22 @@
           <w:shd w:fill="auto" w:val="clear"/>
         </w:rPr>
       </w:pPr>
-    </w:p>
-    <w:p>
-      <w:pPr>
-        <w:keepNext w:val="true"/>
-        <w:keepLines w:val="true"/>
-        <w:spacing w:before="200" w:after="0" w:line="276"/>
-        <w:ind w:right="0" w:left="0" w:firstLine="0"/>
-        <w:jc w:val="left"/>
-        <w:rPr>
-          <w:rFonts w:ascii="Calibri" w:hAnsi="Calibri" w:cs="Calibri" w:eastAsia="Calibri"/>
-          <w:b/>
-          <w:color w:val="4F81BD"/>
-          <w:spacing w:val="0"/>
-          <w:position w:val="0"/>
-          <w:sz w:val="22"/>
-          <w:shd w:fill="auto" w:val="clear"/>
-        </w:rPr>
-      </w:pPr>
-    </w:p>
-    <w:p>
-      <w:pPr>
-        <w:keepNext w:val="true"/>
-        <w:keepLines w:val="true"/>
-        <w:spacing w:before="200" w:after="0" w:line="276"/>
-        <w:ind w:right="0" w:left="0" w:firstLine="0"/>
-        <w:jc w:val="left"/>
-        <w:rPr>
-          <w:rFonts w:ascii="Calibri" w:hAnsi="Calibri" w:cs="Calibri" w:eastAsia="Calibri"/>
-          <w:b/>
-          <w:color w:val="4F81BD"/>
-          <w:spacing w:val="0"/>
-          <w:position w:val="0"/>
-          <w:sz w:val="22"/>
-          <w:shd w:fill="auto" w:val="clear"/>
-        </w:rPr>
-      </w:pPr>
-    </w:p>
-    <w:p>
-      <w:pPr>
-        <w:keepNext w:val="true"/>
-        <w:keepLines w:val="true"/>
-        <w:spacing w:before="200" w:after="0" w:line="276"/>
-        <w:ind w:right="0" w:left="0" w:firstLine="0"/>
-        <w:jc w:val="left"/>
-        <w:rPr>
-          <w:rFonts w:ascii="Calibri" w:hAnsi="Calibri" w:cs="Calibri" w:eastAsia="Calibri"/>
-          <w:b/>
-          <w:color w:val="4F81BD"/>
-          <w:spacing w:val="0"/>
-          <w:position w:val="0"/>
-          <w:sz w:val="22"/>
-          <w:shd w:fill="auto" w:val="clear"/>
-        </w:rPr>
-      </w:pPr>
-    </w:p>
-    <w:p>
-      <w:pPr>
-        <w:keepNext w:val="true"/>
-        <w:keepLines w:val="true"/>
-        <w:spacing w:before="200" w:after="0" w:line="276"/>
-        <w:ind w:right="0" w:left="0" w:firstLine="0"/>
-        <w:jc w:val="left"/>
-        <w:rPr>
-          <w:rFonts w:ascii="Calibri" w:hAnsi="Calibri" w:cs="Calibri" w:eastAsia="Calibri"/>
-          <w:b/>
-          <w:color w:val="4F81BD"/>
-          <w:spacing w:val="0"/>
-          <w:position w:val="0"/>
-          <w:sz w:val="22"/>
-          <w:shd w:fill="auto" w:val="clear"/>
-        </w:rPr>
-      </w:pPr>
-    </w:p>
-    <w:p>
-      <w:pPr>
-        <w:keepNext w:val="true"/>
-        <w:keepLines w:val="true"/>
-        <w:spacing w:before="200" w:after="0" w:line="276"/>
-        <w:ind w:right="0" w:left="0" w:firstLine="0"/>
-        <w:jc w:val="left"/>
-        <w:rPr>
-          <w:rFonts w:ascii="Calibri" w:hAnsi="Calibri" w:cs="Calibri" w:eastAsia="Calibri"/>
-          <w:b/>
-          <w:color w:val="4F81BD"/>
-          <w:spacing w:val="0"/>
-          <w:position w:val="0"/>
-          <w:sz w:val="22"/>
-          <w:shd w:fill="auto" w:val="clear"/>
-        </w:rPr>
-      </w:pPr>
-      <w:r>
-        <w:rPr>
-          <w:rFonts w:ascii="Calibri" w:hAnsi="Calibri" w:cs="Calibri" w:eastAsia="Calibri"/>
-          <w:b/>
-          <w:color w:val="4F81BD"/>
-          <w:spacing w:val="0"/>
-          <w:position w:val="0"/>
-          <w:sz w:val="22"/>
-          <w:shd w:fill="auto" w:val="clear"/>
-        </w:rPr>
-        <w:t xml:space="preserve">Step 3: Update Firmware</w:t>
-      </w:r>
-    </w:p>
-    <w:p>
-      <w:pPr>
-        <w:spacing w:before="0" w:after="200" w:line="276"/>
+      <w:r>
+        <w:rPr>
+          <w:rFonts w:ascii="Calibri" w:hAnsi="Calibri" w:cs="Calibri" w:eastAsia="Calibri"/>
+          <w:b/>
+          <w:color w:val="4F81BD"/>
+          <w:spacing w:val="0"/>
+          <w:position w:val="0"/>
+          <w:sz w:val="22"/>
+          <w:shd w:fill="auto" w:val="clear"/>
+        </w:rPr>
+        <w:t xml:space="preserve">Step 3: Update Firmware:</w:t>
+      </w:r>
+    </w:p>
+    <w:p>
+      <w:pPr>
+        <w:spacing w:before="0" w:after="0" w:line="276"/>
         <w:ind w:right="0" w:left="0" w:firstLine="0"/>
         <w:jc w:val="left"/>
         <w:rPr>
@@ -948,63 +2536,49 @@
     </w:p>
     <w:p>
       <w:pPr>
-        <w:spacing w:before="0" w:after="200" w:line="240"/>
-        <w:ind w:right="0" w:left="0" w:firstLine="0"/>
-        <w:jc w:val="left"/>
-        <w:rPr>
-          <w:rFonts w:ascii="Cambria" w:hAnsi="Cambria" w:cs="Cambria" w:eastAsia="Cambria"/>
-          <w:color w:val="auto"/>
-          <w:spacing w:val="0"/>
-          <w:position w:val="0"/>
-          <w:sz w:val="22"/>
-          <w:shd w:fill="auto" w:val="clear"/>
-        </w:rPr>
-      </w:pPr>
-      <w:r>
-        <w:object w:dxaOrig="9172" w:dyaOrig="1660">
-          <v:rect xmlns:o="urn:schemas-microsoft-com:office:office" xmlns:v="urn:schemas-microsoft-com:vml" id="rectole0000000004" style="width:458.600000pt;height:83.000000pt" o:preferrelative="t" o:ole="">
+        <w:spacing w:before="0" w:after="0" w:line="240"/>
+        <w:ind w:right="0" w:left="0" w:firstLine="0"/>
+        <w:jc w:val="left"/>
+        <w:rPr>
+          <w:rFonts w:ascii="Cambria" w:hAnsi="Cambria" w:cs="Cambria" w:eastAsia="Cambria"/>
+          <w:color w:val="auto"/>
+          <w:spacing w:val="0"/>
+          <w:position w:val="0"/>
+          <w:sz w:val="22"/>
+          <w:shd w:fill="auto" w:val="clear"/>
+        </w:rPr>
+      </w:pPr>
+      <w:r>
+        <w:object w:dxaOrig="9414" w:dyaOrig="1700">
+          <v:rect xmlns:o="urn:schemas-microsoft-com:office:office" xmlns:v="urn:schemas-microsoft-com:vml" id="rectole0000000009" style="width:470.700000pt;height:85.000000pt" o:preferrelative="t" o:ole="">
             <o:lock v:ext="edit"/>
-            <v:imagedata xmlns:r="http://schemas.openxmlformats.org/officeDocument/2006/relationships" r:id="docRId9" o:title=""/>
+            <v:imagedata xmlns:r="http://schemas.openxmlformats.org/officeDocument/2006/relationships" r:id="docRId21" o:title=""/>
           </v:rect>
-          <o:OLEObject xmlns:r="http://schemas.openxmlformats.org/officeDocument/2006/relationships" xmlns:o="urn:schemas-microsoft-com:office:office" Type="Embed" ProgID="StaticDib" DrawAspect="Content" ObjectID="0000000004" ShapeID="rectole0000000004" r:id="docRId8"/>
+          <o:OLEObject xmlns:r="http://schemas.openxmlformats.org/officeDocument/2006/relationships" xmlns:o="urn:schemas-microsoft-com:office:office" Type="Embed" ProgID="StaticDib" DrawAspect="Content" ObjectID="0000000009" ShapeID="rectole0000000009" r:id="docRId20"/>
         </w:object>
       </w:r>
     </w:p>
     <w:p>
       <w:pPr>
-        <w:keepNext w:val="true"/>
-        <w:keepLines w:val="true"/>
-        <w:spacing w:before="200" w:after="0" w:line="276"/>
-        <w:ind w:right="0" w:left="0" w:firstLine="0"/>
-        <w:jc w:val="left"/>
-        <w:rPr>
-          <w:rFonts w:ascii="Calibri" w:hAnsi="Calibri" w:cs="Calibri" w:eastAsia="Calibri"/>
-          <w:b/>
-          <w:color w:val="4F81BD"/>
-          <w:spacing w:val="0"/>
-          <w:position w:val="0"/>
-          <w:sz w:val="22"/>
-          <w:shd w:fill="auto" w:val="clear"/>
-        </w:rPr>
-      </w:pPr>
-      <w:r>
-        <w:rPr>
-          <w:rFonts w:ascii="Calibri" w:hAnsi="Calibri" w:cs="Calibri" w:eastAsia="Calibri"/>
-          <w:b/>
-          <w:color w:val="4F81BD"/>
-          <w:spacing w:val="0"/>
-          <w:position w:val="0"/>
-          <w:sz w:val="22"/>
-          <w:shd w:fill="auto" w:val="clear"/>
-        </w:rPr>
-        <w:t xml:space="preserve"> Steps:</w:t>
-      </w:r>
+        <w:spacing w:before="0" w:after="0" w:line="240"/>
+        <w:ind w:right="0" w:left="0" w:firstLine="0"/>
+        <w:jc w:val="left"/>
+        <w:rPr>
+          <w:rFonts w:ascii="Calibri" w:hAnsi="Calibri" w:cs="Calibri" w:eastAsia="Calibri"/>
+          <w:b/>
+          <w:color w:val="4F81BD"/>
+          <w:spacing w:val="0"/>
+          <w:position w:val="0"/>
+          <w:sz w:val="22"/>
+          <w:shd w:fill="auto" w:val="clear"/>
+        </w:rPr>
+      </w:pPr>
     </w:p>
     <w:p>
       <w:pPr>
         <w:numPr>
           <w:ilvl w:val="0"/>
-          <w:numId w:val="28"/>
+          <w:numId w:val="51"/>
         </w:numPr>
         <w:tabs>
           <w:tab w:val="left" w:pos="360" w:leader="none"/>
@@ -1030,14 +2604,14 @@
           <w:sz w:val="22"/>
           <w:shd w:fill="auto" w:val="clear"/>
         </w:rPr>
-        <w:t xml:space="preserve">1. Compile the firmware using your preferred IDE.</w:t>
+        <w:t xml:space="preserve"> Compile the firmware using your preferred IDE.</w:t>
       </w:r>
     </w:p>
     <w:p>
       <w:pPr>
         <w:numPr>
           <w:ilvl w:val="0"/>
-          <w:numId w:val="28"/>
+          <w:numId w:val="51"/>
         </w:numPr>
         <w:tabs>
           <w:tab w:val="left" w:pos="360" w:leader="none"/>
@@ -1064,7 +2638,7 @@
           <w:sz w:val="22"/>
           <w:shd w:fill="auto" w:val="clear"/>
         </w:rPr>
-        <w:t xml:space="preserve">2. Upload the compiled firmware to the ESP32 device.</w:t>
+        <w:t xml:space="preserve"> Upload the compiled firmware to the ESP32 device.</w:t>
       </w:r>
     </w:p>
     <w:p>
@@ -1102,7 +2676,7 @@
       <w:pPr>
         <w:numPr>
           <w:ilvl w:val="0"/>
-          <w:numId w:val="30"/>
+          <w:numId w:val="53"/>
         </w:numPr>
         <w:tabs>
           <w:tab w:val="left" w:pos="360" w:leader="none"/>
@@ -1152,15 +2726,15 @@
       </w:pPr>
       <w:r>
         <w:rPr>
-          <w:rFonts w:ascii="Calibri" w:hAnsi="Calibri" w:cs="Calibri" w:eastAsia="Calibri"/>
-          <w:b/>
-          <w:color w:val="4F81BD"/>
-          <w:spacing w:val="0"/>
-          <w:position w:val="0"/>
-          <w:sz w:val="22"/>
-          <w:shd w:fill="auto" w:val="clear"/>
-        </w:rPr>
-        <w:t xml:space="preserve">Resources</w:t>
+          <w:rFonts w:ascii="Cambria" w:hAnsi="Cambria" w:cs="Cambria" w:eastAsia="Cambria"/>
+          <w:b/>
+          <w:color w:val="4F81BD"/>
+          <w:spacing w:val="0"/>
+          <w:position w:val="0"/>
+          <w:sz w:val="28"/>
+          <w:shd w:fill="auto" w:val="clear"/>
+        </w:rPr>
+        <w:t xml:space="preserve">Resources:</w:t>
       </w:r>
     </w:p>
     <w:p>
@@ -1249,6 +2823,83 @@
       <w:lvlText w:val="•"/>
     </w:lvl>
   </w:abstractNum>
+  <w:abstractNum w:abstractNumId="6">
+    <w:lvl w:ilvl="0">
+      <w:start w:val="1"/>
+      <w:numFmt w:val="bullet"/>
+      <w:lvlText w:val="•"/>
+    </w:lvl>
+  </w:abstractNum>
+  <w:abstractNum w:abstractNumId="12">
+    <w:lvl w:ilvl="0">
+      <w:start w:val="1"/>
+      <w:numFmt w:val="bullet"/>
+      <w:lvlText w:val="•"/>
+    </w:lvl>
+  </w:abstractNum>
+  <w:abstractNum w:abstractNumId="18">
+    <w:lvl w:ilvl="0">
+      <w:start w:val="1"/>
+      <w:numFmt w:val="bullet"/>
+      <w:lvlText w:val="•"/>
+    </w:lvl>
+  </w:abstractNum>
+  <w:abstractNum w:abstractNumId="24">
+    <w:lvl w:ilvl="0">
+      <w:start w:val="1"/>
+      <w:numFmt w:val="bullet"/>
+      <w:lvlText w:val="•"/>
+    </w:lvl>
+  </w:abstractNum>
+  <w:abstractNum w:abstractNumId="30">
+    <w:lvl w:ilvl="0">
+      <w:start w:val="1"/>
+      <w:numFmt w:val="bullet"/>
+      <w:lvlText w:val="•"/>
+    </w:lvl>
+  </w:abstractNum>
+  <w:abstractNum w:abstractNumId="36">
+    <w:lvl w:ilvl="0">
+      <w:start w:val="1"/>
+      <w:numFmt w:val="bullet"/>
+      <w:lvlText w:val="•"/>
+    </w:lvl>
+  </w:abstractNum>
+  <w:abstractNum w:abstractNumId="42">
+    <w:lvl w:ilvl="0">
+      <w:start w:val="1"/>
+      <w:numFmt w:val="bullet"/>
+      <w:lvlText w:val="•"/>
+    </w:lvl>
+  </w:abstractNum>
+  <w:abstractNum w:abstractNumId="48">
+    <w:lvl w:ilvl="0">
+      <w:start w:val="1"/>
+      <w:numFmt w:val="bullet"/>
+      <w:lvlText w:val="•"/>
+    </w:lvl>
+  </w:abstractNum>
+  <w:abstractNum w:abstractNumId="54">
+    <w:lvl w:ilvl="0">
+      <w:start w:val="1"/>
+      <w:numFmt w:val="bullet"/>
+      <w:lvlText w:val="•"/>
+    </w:lvl>
+  </w:abstractNum>
+  <w:abstractNum w:abstractNumId="60">
+    <w:lvl w:ilvl="0">
+      <w:start w:val="1"/>
+      <w:numFmt w:val="bullet"/>
+      <w:lvlText w:val="•"/>
+    </w:lvl>
+  </w:abstractNum>
+  <w:abstractNum w:abstractNumId="66">
+    <w:lvl w:ilvl="0">
+      <w:start w:val="1"/>
+      <w:numFmt w:val="bullet"/>
+      <w:lvlText w:val="•"/>
+    </w:lvl>
+  </w:abstractNum>
   <w:abstractNum w:abstractNumId="1">
     <w:lvl w:ilvl="0">
       <w:start w:val="1"/>
@@ -1256,20 +2907,53 @@
       <w:lvlText w:val="%1."/>
     </w:lvl>
   </w:abstractNum>
-  <w:abstractNum w:abstractNumId="6">
+  <w:abstractNum w:abstractNumId="72">
     <w:lvl w:ilvl="0">
       <w:start w:val="1"/>
       <w:numFmt w:val="bullet"/>
       <w:lvlText w:val="•"/>
     </w:lvl>
   </w:abstractNum>
-  <w:num w:numId="12">
+  <w:num w:numId="4">
+    <w:abstractNumId w:val="72"/>
+  </w:num>
+  <w:num w:numId="7">
+    <w:abstractNumId w:val="66"/>
+  </w:num>
+  <w:num w:numId="9">
+    <w:abstractNumId w:val="60"/>
+  </w:num>
+  <w:num w:numId="11">
+    <w:abstractNumId w:val="54"/>
+  </w:num>
+  <w:num w:numId="13">
+    <w:abstractNumId w:val="48"/>
+  </w:num>
+  <w:num w:numId="15">
+    <w:abstractNumId w:val="42"/>
+  </w:num>
+  <w:num w:numId="17">
+    <w:abstractNumId w:val="36"/>
+  </w:num>
+  <w:num w:numId="19">
+    <w:abstractNumId w:val="30"/>
+  </w:num>
+  <w:num w:numId="21">
+    <w:abstractNumId w:val="24"/>
+  </w:num>
+  <w:num w:numId="23">
+    <w:abstractNumId w:val="18"/>
+  </w:num>
+  <w:num w:numId="25">
+    <w:abstractNumId w:val="12"/>
+  </w:num>
+  <w:num w:numId="37">
     <w:abstractNumId w:val="6"/>
   </w:num>
-  <w:num w:numId="28">
+  <w:num w:numId="51">
     <w:abstractNumId w:val="1"/>
   </w:num>
-  <w:num w:numId="30">
+  <w:num w:numId="53">
     <w:abstractNumId w:val="0"/>
   </w:num>
 </w:numbering>

</xml_diff>